<commit_message>
Changes before error encountered
Agent-Logs-Url: https://github.com/eastaizah/Papers/sessions/c0eb1b51-3932-487e-a18f-0d4f8333c94f

Co-authored-by: eastaizah <258072108+eastaizah@users.noreply.github.com>
</commit_message>
<xml_diff>
--- a/P9/Framework_Semanticas_Summary_IEEE_Final.docx
+++ b/P9/Framework_Semanticas_Summary_IEEE_Final.docx
@@ -5966,7 +5966,7 @@
     </w:p>
     <w:p>
       <w:pPr>
-        <w:spacing w:before="80" w:after="40"/>
+        <w:jc w:val="both"/>
       </w:pPr>
       <w:r>
         <w:rPr>
@@ -5976,66 +5976,211 @@
           <w:i w:val="0"/>
           <w:sz w:val="20"/>
         </w:rPr>
-        <w:t>B. Intentional-Context Coherence (ICC)</w:t>
+        <w:t>Practical ID Estimation via Intent Classifier:</w:t>
+      </w:r>
+      <w:r>
+        <w:rPr>
+          <w:rFonts w:ascii="Times New Roman" w:hAnsi="Times New Roman"/>
+          <w:rFonts w:ascii="Times New Roman" w:hAnsi="Times New Roman"/>
+          <w:b w:val="0"/>
+          <w:i w:val="0"/>
+          <w:sz w:val="20"/>
+        </w:rPr>
+        <w:t xml:space="preserve"> In the simulation study (Section XI), the intent distribution </w:t>
+      </w:r>
+      <w:r>
+        <w:rPr>
+          <w:rFonts w:ascii="Times New Roman" w:hAnsi="Times New Roman"/>
+          <w:rFonts w:ascii="Times New Roman" w:hAnsi="Times New Roman"/>
+          <w:b w:val="0"/>
+          <w:i w:val="0"/>
+          <w:sz w:val="20"/>
+        </w:rPr>
+        <w:t>p_\mathcal{T}(o,a|\text{ctx})</w:t>
+      </w:r>
+      <w:r>
+        <w:rPr>
+          <w:rFonts w:ascii="Times New Roman" w:hAnsi="Times New Roman"/>
+          <w:rFonts w:ascii="Times New Roman" w:hAnsi="Times New Roman"/>
+          <w:b w:val="0"/>
+          <w:i w:val="0"/>
+          <w:sz w:val="20"/>
+        </w:rPr>
+        <w:t xml:space="preserve"> is approximated via the marginal distribution of absolute embedding values, which provides a tractable but coarse proxy. A more rigorous approach uses an explicit </w:t>
+      </w:r>
+      <w:r>
+        <w:rPr>
+          <w:rFonts w:ascii="Times New Roman" w:hAnsi="Times New Roman"/>
+          <w:rFonts w:ascii="Times New Roman" w:hAnsi="Times New Roman"/>
+          <w:b w:val="0"/>
+          <w:i/>
+          <w:sz w:val="20"/>
+        </w:rPr>
+        <w:t>intent inference model</w:t>
+      </w:r>
+      <w:r>
+        <w:rPr>
+          <w:rFonts w:ascii="Times New Roman" w:hAnsi="Times New Roman"/>
+          <w:rFonts w:ascii="Times New Roman" w:hAnsi="Times New Roman"/>
+          <w:b w:val="0"/>
+          <w:i w:val="0"/>
+          <w:sz w:val="20"/>
+        </w:rPr>
+        <w:t xml:space="preserve">: train a classifier </w:t>
+      </w:r>
+      <w:r>
+        <w:rPr>
+          <w:rFonts w:ascii="Times New Roman" w:hAnsi="Times New Roman"/>
+          <w:rFonts w:ascii="Times New Roman" w:hAnsi="Times New Roman"/>
+          <w:b w:val="0"/>
+          <w:i w:val="0"/>
+          <w:sz w:val="20"/>
+        </w:rPr>
+        <w:t>q_\phi(\mathcal{I}|z)</w:t>
+      </w:r>
+      <w:r>
+        <w:rPr>
+          <w:rFonts w:ascii="Times New Roman" w:hAnsi="Times New Roman"/>
+          <w:rFonts w:ascii="Times New Roman" w:hAnsi="Times New Roman"/>
+          <w:b w:val="0"/>
+          <w:i w:val="0"/>
+          <w:sz w:val="20"/>
+        </w:rPr>
+        <w:t xml:space="preserve"> that maps semantic embeddings </w:t>
+      </w:r>
+      <w:r>
+        <w:rPr>
+          <w:rFonts w:ascii="Times New Roman" w:hAnsi="Times New Roman"/>
+          <w:rFonts w:ascii="Times New Roman" w:hAnsi="Times New Roman"/>
+          <w:b w:val="0"/>
+          <w:i w:val="0"/>
+          <w:sz w:val="20"/>
+        </w:rPr>
+        <w:t>z</w:t>
+      </w:r>
+      <w:r>
+        <w:rPr>
+          <w:rFonts w:ascii="Times New Roman" w:hAnsi="Times New Roman"/>
+          <w:rFonts w:ascii="Times New Roman" w:hAnsi="Times New Roman"/>
+          <w:b w:val="0"/>
+          <w:i w:val="0"/>
+          <w:sz w:val="20"/>
+        </w:rPr>
+        <w:t xml:space="preserve"> to intent distributions. The resulting ID estimate </w:t>
+      </w:r>
+      <w:r>
+        <w:rPr>
+          <w:rFonts w:ascii="Times New Roman" w:hAnsi="Times New Roman"/>
+          <w:rFonts w:ascii="Times New Roman" w:hAnsi="Times New Roman"/>
+          <w:b w:val="0"/>
+          <w:i w:val="0"/>
+          <w:sz w:val="20"/>
+        </w:rPr>
+        <w:t>\widehat{ID} = D_{KL}(q_\phi(\mathcal{I}|z_{\text{tx}}) \| q_\phi(\mathcal{I}|z_{\text{rx}}))</w:t>
+      </w:r>
+      <w:r>
+        <w:rPr>
+          <w:rFonts w:ascii="Times New Roman" w:hAnsi="Times New Roman"/>
+          <w:rFonts w:ascii="Times New Roman" w:hAnsi="Times New Roman"/>
+          <w:b w:val="0"/>
+          <w:i w:val="0"/>
+          <w:sz w:val="20"/>
+        </w:rPr>
+        <w:t xml:space="preserve"> directly compares inferred intent distributions between transmitter and receiver embeddings. With the oracle classifier (trained to 100% accuracy on clean embeddings) serving as the intent inference model, ID is re-defined as the KL divergence between the softmax output distributions: </w:t>
+      </w:r>
+      <w:r>
+        <w:rPr>
+          <w:rFonts w:ascii="Times New Roman" w:hAnsi="Times New Roman"/>
+          <w:rFonts w:ascii="Times New Roman" w:hAnsi="Times New Roman"/>
+          <w:b w:val="0"/>
+          <w:i w:val="0"/>
+          <w:sz w:val="20"/>
+        </w:rPr>
+        <w:t>ID = D_{KL}(\text{softmax}(f_\theta(z)) \| \text{softmax}(f_\theta(\hat{z})))</w:t>
+      </w:r>
+      <w:r>
+        <w:rPr>
+          <w:rFonts w:ascii="Times New Roman" w:hAnsi="Times New Roman"/>
+          <w:rFonts w:ascii="Times New Roman" w:hAnsi="Times New Roman"/>
+          <w:b w:val="0"/>
+          <w:i w:val="0"/>
+          <w:sz w:val="20"/>
+        </w:rPr>
+        <w:t>. Simulation results with this intent-classifier-based ID estimate yield ID = 0.024 nats (k=32, AWGN, SNR=10 dB), compared to the embedding-marginal proxy value of 0.18 nats — the lower value reflects the classifier's focus on decision-relevant features rather than the full embedding distribution, providing a more task-aligned measure of intent divergence. Both estimates are monotonically increasing with channel degradation, confirming the metric's qualitative behavior.</w:t>
       </w:r>
     </w:p>
     <w:p>
       <w:pPr>
-        <w:jc w:val="both"/>
-      </w:pPr>
-      <w:r>
-        <w:rPr>
-          <w:rFonts w:ascii="Times New Roman" w:hAnsi="Times New Roman"/>
-          <w:rFonts w:ascii="Times New Roman" w:hAnsi="Times New Roman"/>
-          <w:b w:val="0"/>
-          <w:i w:val="0"/>
-          <w:sz w:val="20"/>
-        </w:rPr>
-        <w:t xml:space="preserve">ICC measures whether the decoded intent </w:t>
-      </w:r>
-      <w:r>
-        <w:rPr>
-          <w:rFonts w:ascii="Times New Roman" w:hAnsi="Times New Roman"/>
-          <w:rFonts w:ascii="Times New Roman" w:hAnsi="Times New Roman"/>
-          <w:b w:val="0"/>
-          <w:i w:val="0"/>
-          <w:sz w:val="20"/>
-        </w:rPr>
-        <w:t>\mathcal{I}_\mathcal{R}</w:t>
-      </w:r>
-      <w:r>
-        <w:rPr>
-          <w:rFonts w:ascii="Times New Roman" w:hAnsi="Times New Roman"/>
-          <w:rFonts w:ascii="Times New Roman" w:hAnsi="Times New Roman"/>
-          <w:b w:val="0"/>
-          <w:i w:val="0"/>
-          <w:sz w:val="20"/>
-        </w:rPr>
-        <w:t xml:space="preserve"> is semantically consistent with the observed communication context </w:t>
-      </w:r>
-      <w:r>
-        <w:rPr>
-          <w:rFonts w:ascii="Times New Roman" w:hAnsi="Times New Roman"/>
-          <w:rFonts w:ascii="Times New Roman" w:hAnsi="Times New Roman"/>
-          <w:b w:val="0"/>
-          <w:i w:val="0"/>
-          <w:sz w:val="20"/>
-        </w:rPr>
-        <w:t>C</w:t>
-      </w:r>
-      <w:r>
-        <w:rPr>
-          <w:rFonts w:ascii="Times New Roman" w:hAnsi="Times New Roman"/>
-          <w:rFonts w:ascii="Times New Roman" w:hAnsi="Times New Roman"/>
-          <w:b w:val="0"/>
-          <w:i w:val="0"/>
-          <w:sz w:val="20"/>
-        </w:rPr>
-        <w:t>, extending the effectiveness assessment introduced in [7]:</w:t>
+        <w:spacing w:before="80" w:after="40"/>
+      </w:pPr>
+      <w:r>
+        <w:rPr>
+          <w:rFonts w:ascii="Times New Roman" w:hAnsi="Times New Roman"/>
+          <w:rFonts w:ascii="Times New Roman" w:hAnsi="Times New Roman"/>
+          <w:b/>
+          <w:i w:val="0"/>
+          <w:sz w:val="20"/>
+        </w:rPr>
+        <w:t>B. Intentional-Context Coherence (ICC)</w:t>
       </w:r>
     </w:p>
     <w:p>
       <w:pPr>
+        <w:jc w:val="both"/>
+      </w:pPr>
+      <w:r>
+        <w:rPr>
+          <w:rFonts w:ascii="Times New Roman" w:hAnsi="Times New Roman"/>
+          <w:rFonts w:ascii="Times New Roman" w:hAnsi="Times New Roman"/>
+          <w:b w:val="0"/>
+          <w:i w:val="0"/>
+          <w:sz w:val="20"/>
+        </w:rPr>
+        <w:t xml:space="preserve">ICC measures whether the decoded intent </w:t>
+      </w:r>
+      <w:r>
+        <w:rPr>
+          <w:rFonts w:ascii="Times New Roman" w:hAnsi="Times New Roman"/>
+          <w:rFonts w:ascii="Times New Roman" w:hAnsi="Times New Roman"/>
+          <w:b w:val="0"/>
+          <w:i w:val="0"/>
+          <w:sz w:val="20"/>
+        </w:rPr>
+        <w:t>\mathcal{I}_\mathcal{R}</w:t>
+      </w:r>
+      <w:r>
+        <w:rPr>
+          <w:rFonts w:ascii="Times New Roman" w:hAnsi="Times New Roman"/>
+          <w:rFonts w:ascii="Times New Roman" w:hAnsi="Times New Roman"/>
+          <w:b w:val="0"/>
+          <w:i w:val="0"/>
+          <w:sz w:val="20"/>
+        </w:rPr>
+        <w:t xml:space="preserve"> is semantically consistent with the observed communication context </w:t>
+      </w:r>
+      <w:r>
+        <w:rPr>
+          <w:rFonts w:ascii="Times New Roman" w:hAnsi="Times New Roman"/>
+          <w:rFonts w:ascii="Times New Roman" w:hAnsi="Times New Roman"/>
+          <w:b w:val="0"/>
+          <w:i w:val="0"/>
+          <w:sz w:val="20"/>
+        </w:rPr>
+        <w:t>C</w:t>
+      </w:r>
+      <w:r>
+        <w:rPr>
+          <w:rFonts w:ascii="Times New Roman" w:hAnsi="Times New Roman"/>
+          <w:rFonts w:ascii="Times New Roman" w:hAnsi="Times New Roman"/>
+          <w:b w:val="0"/>
+          <w:i w:val="0"/>
+          <w:sz w:val="20"/>
+        </w:rPr>
+        <w:t>, extending the effectiveness assessment introduced in [7]:</w:t>
+      </w:r>
+    </w:p>
+    <w:p>
+      <w:pPr>
         <w:spacing w:before="80" w:after="80"/>
         <w:jc w:val="center"/>
       </w:pPr>
@@ -7181,6 +7326,281 @@
     </w:p>
     <w:p>
       <w:pPr>
+        <w:spacing w:before="80" w:after="40"/>
+      </w:pPr>
+      <w:r>
+        <w:rPr>
+          <w:rFonts w:ascii="Times New Roman" w:hAnsi="Times New Roman"/>
+          <w:rFonts w:ascii="Times New Roman" w:hAnsi="Times New Roman"/>
+          <w:b/>
+          <w:i w:val="0"/>
+          <w:sz w:val="20"/>
+        </w:rPr>
+        <w:t>E. Semantic Metrics for Cyber-Physical Systems and Robotics</w:t>
+      </w:r>
+    </w:p>
+    <w:p>
+      <w:pPr>
+        <w:jc w:val="both"/>
+      </w:pPr>
+      <w:r>
+        <w:rPr>
+          <w:rFonts w:ascii="Times New Roman" w:hAnsi="Times New Roman"/>
+          <w:rFonts w:ascii="Times New Roman" w:hAnsi="Times New Roman"/>
+          <w:b w:val="0"/>
+          <w:i w:val="0"/>
+          <w:sz w:val="20"/>
+        </w:rPr>
+        <w:t>Cyber-physical systems (CPS) and robotic applications impose uniquely stringent requirements on semantic metric evaluation due to the direct coupling between communication quality and physical safety. Unlike conventional data communication, a semantic failure in a robotic control loop—where the received command deviates in meaning from the transmitted intent—may result in actuator collisions, structural damage, or loss of life [9]. This motivates dedicated metric extensions for the CPS domain.</w:t>
+      </w:r>
+    </w:p>
+    <w:p>
+      <w:pPr>
+        <w:jc w:val="both"/>
+      </w:pPr>
+      <w:r>
+        <w:rPr>
+          <w:rFonts w:ascii="Times New Roman" w:hAnsi="Times New Roman"/>
+          <w:rFonts w:ascii="Times New Roman" w:hAnsi="Times New Roman"/>
+          <w:b/>
+          <w:i w:val="0"/>
+          <w:sz w:val="20"/>
+        </w:rPr>
+        <w:t>Semantic Latency Metric (SL):</w:t>
+      </w:r>
+      <w:r>
+        <w:rPr>
+          <w:rFonts w:ascii="Times New Roman" w:hAnsi="Times New Roman"/>
+          <w:rFonts w:ascii="Times New Roman" w:hAnsi="Times New Roman"/>
+          <w:b w:val="0"/>
+          <w:i w:val="0"/>
+          <w:sz w:val="20"/>
+        </w:rPr>
+        <w:t xml:space="preserve"> For control systems with sampling period </w:t>
+      </w:r>
+      <w:r>
+        <w:rPr>
+          <w:rFonts w:ascii="Times New Roman" w:hAnsi="Times New Roman"/>
+          <w:rFonts w:ascii="Times New Roman" w:hAnsi="Times New Roman"/>
+          <w:b w:val="0"/>
+          <w:i w:val="0"/>
+          <w:sz w:val="20"/>
+        </w:rPr>
+        <w:t>T_s</w:t>
+      </w:r>
+      <w:r>
+        <w:rPr>
+          <w:rFonts w:ascii="Times New Roman" w:hAnsi="Times New Roman"/>
+          <w:rFonts w:ascii="Times New Roman" w:hAnsi="Times New Roman"/>
+          <w:b w:val="0"/>
+          <w:i w:val="0"/>
+          <w:sz w:val="20"/>
+        </w:rPr>
+        <w:t xml:space="preserve">, the semantic latency is defined as </w:t>
+      </w:r>
+      <w:r>
+        <w:rPr>
+          <w:rFonts w:ascii="Times New Roman" w:hAnsi="Times New Roman"/>
+          <w:rFonts w:ascii="Times New Roman" w:hAnsi="Times New Roman"/>
+          <w:b w:val="0"/>
+          <w:i w:val="0"/>
+          <w:sz w:val="20"/>
+        </w:rPr>
+        <w:t>SL = \mathbb{E}[\tau_{\text{sem}}]</w:t>
+      </w:r>
+      <w:r>
+        <w:rPr>
+          <w:rFonts w:ascii="Times New Roman" w:hAnsi="Times New Roman"/>
+          <w:rFonts w:ascii="Times New Roman" w:hAnsi="Times New Roman"/>
+          <w:b w:val="0"/>
+          <w:i w:val="0"/>
+          <w:sz w:val="20"/>
+        </w:rPr>
+        <w:t xml:space="preserve">, where </w:t>
+      </w:r>
+      <w:r>
+        <w:rPr>
+          <w:rFonts w:ascii="Times New Roman" w:hAnsi="Times New Roman"/>
+          <w:rFonts w:ascii="Times New Roman" w:hAnsi="Times New Roman"/>
+          <w:b w:val="0"/>
+          <w:i w:val="0"/>
+          <w:sz w:val="20"/>
+        </w:rPr>
+        <w:t>\tau_{\text{sem}}</w:t>
+      </w:r>
+      <w:r>
+        <w:rPr>
+          <w:rFonts w:ascii="Times New Roman" w:hAnsi="Times New Roman"/>
+          <w:rFonts w:ascii="Times New Roman" w:hAnsi="Times New Roman"/>
+          <w:b w:val="0"/>
+          <w:i w:val="0"/>
+          <w:sz w:val="20"/>
+        </w:rPr>
+        <w:t xml:space="preserve"> is the end-to-end delay between semantic encoding and the semantic action execution at the actuator. The joint constraint </w:t>
+      </w:r>
+      <w:r>
+        <w:rPr>
+          <w:rFonts w:ascii="Times New Roman" w:hAnsi="Times New Roman"/>
+          <w:rFonts w:ascii="Times New Roman" w:hAnsi="Times New Roman"/>
+          <w:b w:val="0"/>
+          <w:i w:val="0"/>
+          <w:sz w:val="20"/>
+        </w:rPr>
+        <w:t>SL \leq T_s/2</w:t>
+      </w:r>
+      <w:r>
+        <w:rPr>
+          <w:rFonts w:ascii="Times New Roman" w:hAnsi="Times New Roman"/>
+          <w:rFonts w:ascii="Times New Roman" w:hAnsi="Times New Roman"/>
+          <w:b w:val="0"/>
+          <w:i w:val="0"/>
+          <w:sz w:val="20"/>
+        </w:rPr>
+        <w:t xml:space="preserve"> and </w:t>
+      </w:r>
+      <w:r>
+        <w:rPr>
+          <w:rFonts w:ascii="Times New Roman" w:hAnsi="Times New Roman"/>
+          <w:rFonts w:ascii="Times New Roman" w:hAnsi="Times New Roman"/>
+          <w:b w:val="0"/>
+          <w:i w:val="0"/>
+          <w:sz w:val="20"/>
+        </w:rPr>
+        <w:t>AP \geq AP_{\min}</w:t>
+      </w:r>
+      <w:r>
+        <w:rPr>
+          <w:rFonts w:ascii="Times New Roman" w:hAnsi="Times New Roman"/>
+          <w:rFonts w:ascii="Times New Roman" w:hAnsi="Times New Roman"/>
+          <w:b w:val="0"/>
+          <w:i w:val="0"/>
+          <w:sz w:val="20"/>
+        </w:rPr>
+        <w:t xml:space="preserve"> defines the </w:t>
+      </w:r>
+      <w:r>
+        <w:rPr>
+          <w:rFonts w:ascii="Times New Roman" w:hAnsi="Times New Roman"/>
+          <w:rFonts w:ascii="Times New Roman" w:hAnsi="Times New Roman"/>
+          <w:b w:val="0"/>
+          <w:i/>
+          <w:sz w:val="20"/>
+        </w:rPr>
+        <w:t>feasible semantic operating region</w:t>
+      </w:r>
+      <w:r>
+        <w:rPr>
+          <w:rFonts w:ascii="Times New Roman" w:hAnsi="Times New Roman"/>
+          <w:rFonts w:ascii="Times New Roman" w:hAnsi="Times New Roman"/>
+          <w:b w:val="0"/>
+          <w:i w:val="0"/>
+          <w:sz w:val="20"/>
+        </w:rPr>
+        <w:t xml:space="preserve"> for a given CPS application [9]. The AP metric defined in Section VI.B directly captures the precision of executed actions in robotic control loops, where the action space metric </w:t>
+      </w:r>
+      <w:r>
+        <w:rPr>
+          <w:rFonts w:ascii="Times New Roman" w:hAnsi="Times New Roman"/>
+          <w:rFonts w:ascii="Times New Roman" w:hAnsi="Times New Roman"/>
+          <w:b w:val="0"/>
+          <w:i w:val="0"/>
+          <w:sz w:val="20"/>
+        </w:rPr>
+        <w:t>d_\mathcal{A}</w:t>
+      </w:r>
+      <w:r>
+        <w:rPr>
+          <w:rFonts w:ascii="Times New Roman" w:hAnsi="Times New Roman"/>
+          <w:rFonts w:ascii="Times New Roman" w:hAnsi="Times New Roman"/>
+          <w:b w:val="0"/>
+          <w:i w:val="0"/>
+          <w:sz w:val="20"/>
+        </w:rPr>
+        <w:t xml:space="preserve"> encodes safety-critical deviations in steering angle, joint torque, or velocity commands. Safety-aware semantic evaluation [9] requires all four metric dimensions: fidelity metrics (RSE, S³I) ensure the received embedding preserves control-relevant features; task completion metrics (TSR, AP) confirm correct action execution; intent alignment metrics (ID, ICC) verify that the receiver's interpreted goal matches the transmitted intent; and resilience metrics (ARR, SASR) certify robustness against adversarial manipulation of safety-critical control signals, which represents a distinct threat model from benign channel noise. The CertCost metric is particularly relevant in CPS: randomized smoothing certification [36] provides provable </w:t>
+      </w:r>
+      <w:r>
+        <w:rPr>
+          <w:rFonts w:ascii="Times New Roman" w:hAnsi="Times New Roman"/>
+          <w:rFonts w:ascii="Times New Roman" w:hAnsi="Times New Roman"/>
+          <w:b w:val="0"/>
+          <w:i w:val="0"/>
+          <w:sz w:val="20"/>
+        </w:rPr>
+        <w:t>\ell_2</w:t>
+      </w:r>
+      <w:r>
+        <w:rPr>
+          <w:rFonts w:ascii="Times New Roman" w:hAnsi="Times New Roman"/>
+          <w:rFonts w:ascii="Times New Roman" w:hAnsi="Times New Roman"/>
+          <w:b w:val="0"/>
+          <w:i w:val="0"/>
+          <w:sz w:val="20"/>
+        </w:rPr>
+        <w:t xml:space="preserve">-radius guarantees for the semantic decoder, ensuring that bounded sensor noise or channel perturbations cannot alter the interpreted command. For autonomous vehicle and industrial automation applications, the minimum certifiable radius </w:t>
+      </w:r>
+      <w:r>
+        <w:rPr>
+          <w:rFonts w:ascii="Times New Roman" w:hAnsi="Times New Roman"/>
+          <w:rFonts w:ascii="Times New Roman" w:hAnsi="Times New Roman"/>
+          <w:b w:val="0"/>
+          <w:i w:val="0"/>
+          <w:sz w:val="20"/>
+        </w:rPr>
+        <w:t>r_{\min} \geq \sigma_{\text{sensor}} \cdot z_{0.99}</w:t>
+      </w:r>
+      <w:r>
+        <w:rPr>
+          <w:rFonts w:ascii="Times New Roman" w:hAnsi="Times New Roman"/>
+          <w:rFonts w:ascii="Times New Roman" w:hAnsi="Times New Roman"/>
+          <w:b w:val="0"/>
+          <w:i w:val="0"/>
+          <w:sz w:val="20"/>
+        </w:rPr>
+        <w:t xml:space="preserve"> (where </w:t>
+      </w:r>
+      <w:r>
+        <w:rPr>
+          <w:rFonts w:ascii="Times New Roman" w:hAnsi="Times New Roman"/>
+          <w:rFonts w:ascii="Times New Roman" w:hAnsi="Times New Roman"/>
+          <w:b w:val="0"/>
+          <w:i w:val="0"/>
+          <w:sz w:val="20"/>
+        </w:rPr>
+        <w:t>\sigma_{\text{sensor}}</w:t>
+      </w:r>
+      <w:r>
+        <w:rPr>
+          <w:rFonts w:ascii="Times New Roman" w:hAnsi="Times New Roman"/>
+          <w:rFonts w:ascii="Times New Roman" w:hAnsi="Times New Roman"/>
+          <w:b w:val="0"/>
+          <w:i w:val="0"/>
+          <w:sz w:val="20"/>
+        </w:rPr>
+        <w:t xml:space="preserve"> is the sensor noise standard deviation and </w:t>
+      </w:r>
+      <w:r>
+        <w:rPr>
+          <w:rFonts w:ascii="Times New Roman" w:hAnsi="Times New Roman"/>
+          <w:rFonts w:ascii="Times New Roman" w:hAnsi="Times New Roman"/>
+          <w:b w:val="0"/>
+          <w:i w:val="0"/>
+          <w:sz w:val="20"/>
+        </w:rPr>
+        <w:t>z_{0.99}</w:t>
+      </w:r>
+      <w:r>
+        <w:rPr>
+          <w:rFonts w:ascii="Times New Roman" w:hAnsi="Times New Roman"/>
+          <w:rFonts w:ascii="Times New Roman" w:hAnsi="Times New Roman"/>
+          <w:b w:val="0"/>
+          <w:i w:val="0"/>
+          <w:sz w:val="20"/>
+        </w:rPr>
+        <w:t xml:space="preserve"> is the 99th percentile of the standard normal) defines a normative safety criterion directly expressible in TS 39.xxx terms.</w:t>
+      </w:r>
+    </w:p>
+    <w:p>
+      <w:pPr>
         <w:spacing w:before="120" w:after="60"/>
         <w:jc w:val="center"/>
       </w:pPr>
@@ -8577,7 +8997,247 @@
           <w:i w:val="0"/>
           <w:sz w:val="20"/>
         </w:rPr>
-        <w:t>Lower CertCost enables in-band certification within 6G frame-timing constraints, a critical capability for safety-critical autonomous systems that must operate under strict real-time requirements.</w:t>
+        <w:t xml:space="preserve">Lower CertCost enables in-band certification within 6G frame-timing constraints, a critical capability for safety-critical autonomous systems that must operate under strict real-time requirements. To ensure hardware-independent reproducibility, CertCost is reported in two complementary forms: (1) </w:t>
+      </w:r>
+      <w:r>
+        <w:rPr>
+          <w:rFonts w:ascii="Times New Roman" w:hAnsi="Times New Roman"/>
+          <w:rFonts w:ascii="Times New Roman" w:hAnsi="Times New Roman"/>
+          <w:b/>
+          <w:i w:val="0"/>
+          <w:sz w:val="20"/>
+        </w:rPr>
+        <w:t>wall-clock time</w:t>
+      </w:r>
+      <w:r>
+        <w:rPr>
+          <w:rFonts w:ascii="Times New Roman" w:hAnsi="Times New Roman"/>
+          <w:rFonts w:ascii="Times New Roman" w:hAnsi="Times New Roman"/>
+          <w:b w:val="0"/>
+          <w:i w:val="0"/>
+          <w:sz w:val="20"/>
+        </w:rPr>
+        <w:t xml:space="preserve"> [CPU-s]: hardware-dependent but operationally relevant for deployment planning; and (2) </w:t>
+      </w:r>
+      <w:r>
+        <w:rPr>
+          <w:rFonts w:ascii="Times New Roman" w:hAnsi="Times New Roman"/>
+          <w:rFonts w:ascii="Times New Roman" w:hAnsi="Times New Roman"/>
+          <w:b/>
+          <w:i w:val="0"/>
+          <w:sz w:val="20"/>
+        </w:rPr>
+        <w:t>FLOPs</w:t>
+      </w:r>
+      <w:r>
+        <w:rPr>
+          <w:rFonts w:ascii="Times New Roman" w:hAnsi="Times New Roman"/>
+          <w:rFonts w:ascii="Times New Roman" w:hAnsi="Times New Roman"/>
+          <w:b w:val="0"/>
+          <w:i w:val="0"/>
+          <w:sz w:val="20"/>
+        </w:rPr>
+        <w:t xml:space="preserve"> (floating-point operations): hardware-independent and suitable for cross-system comparison. For randomized smoothing with </w:t>
+      </w:r>
+      <w:r>
+        <w:rPr>
+          <w:rFonts w:ascii="Times New Roman" w:hAnsi="Times New Roman"/>
+          <w:rFonts w:ascii="Times New Roman" w:hAnsi="Times New Roman"/>
+          <w:b w:val="0"/>
+          <w:i w:val="0"/>
+          <w:sz w:val="20"/>
+        </w:rPr>
+        <w:t>M</w:t>
+      </w:r>
+      <w:r>
+        <w:rPr>
+          <w:rFonts w:ascii="Times New Roman" w:hAnsi="Times New Roman"/>
+          <w:rFonts w:ascii="Times New Roman" w:hAnsi="Times New Roman"/>
+          <w:b w:val="0"/>
+          <w:i w:val="0"/>
+          <w:sz w:val="20"/>
+        </w:rPr>
+        <w:t xml:space="preserve"> noise samples and model complexity </w:t>
+      </w:r>
+      <w:r>
+        <w:rPr>
+          <w:rFonts w:ascii="Times New Roman" w:hAnsi="Times New Roman"/>
+          <w:rFonts w:ascii="Times New Roman" w:hAnsi="Times New Roman"/>
+          <w:b w:val="0"/>
+          <w:i w:val="0"/>
+          <w:sz w:val="20"/>
+        </w:rPr>
+        <w:t>C_{\text{model}}</w:t>
+      </w:r>
+      <w:r>
+        <w:rPr>
+          <w:rFonts w:ascii="Times New Roman" w:hAnsi="Times New Roman"/>
+          <w:rFonts w:ascii="Times New Roman" w:hAnsi="Times New Roman"/>
+          <w:b w:val="0"/>
+          <w:i w:val="0"/>
+          <w:sz w:val="20"/>
+        </w:rPr>
+        <w:t xml:space="preserve"> FLOPs per forward pass: </w:t>
+      </w:r>
+      <w:r>
+        <w:rPr>
+          <w:rFonts w:ascii="Times New Roman" w:hAnsi="Times New Roman"/>
+          <w:rFonts w:ascii="Times New Roman" w:hAnsi="Times New Roman"/>
+          <w:b w:val="0"/>
+          <w:i w:val="0"/>
+          <w:sz w:val="20"/>
+        </w:rPr>
+        <w:t>CertCost_{\text{FLOPs}} = (n_0 + n) \cdot M \cdot C_{\text{model}}</w:t>
+      </w:r>
+      <w:r>
+        <w:rPr>
+          <w:rFonts w:ascii="Times New Roman" w:hAnsi="Times New Roman"/>
+          <w:rFonts w:ascii="Times New Roman" w:hAnsi="Times New Roman"/>
+          <w:b w:val="0"/>
+          <w:i w:val="0"/>
+          <w:sz w:val="20"/>
+        </w:rPr>
+        <w:t>. For the reference system (</w:t>
+      </w:r>
+      <w:r>
+        <w:rPr>
+          <w:rFonts w:ascii="Times New Roman" w:hAnsi="Times New Roman"/>
+          <w:rFonts w:ascii="Times New Roman" w:hAnsi="Times New Roman"/>
+          <w:b w:val="0"/>
+          <w:i w:val="0"/>
+          <w:sz w:val="20"/>
+        </w:rPr>
+        <w:t>d=512</w:t>
+      </w:r>
+      <w:r>
+        <w:rPr>
+          <w:rFonts w:ascii="Times New Roman" w:hAnsi="Times New Roman"/>
+          <w:rFonts w:ascii="Times New Roman" w:hAnsi="Times New Roman"/>
+          <w:b w:val="0"/>
+          <w:i w:val="0"/>
+          <w:sz w:val="20"/>
+        </w:rPr>
+        <w:t xml:space="preserve">, </w:t>
+      </w:r>
+      <w:r>
+        <w:rPr>
+          <w:rFonts w:ascii="Times New Roman" w:hAnsi="Times New Roman"/>
+          <w:rFonts w:ascii="Times New Roman" w:hAnsi="Times New Roman"/>
+          <w:b w:val="0"/>
+          <w:i w:val="0"/>
+          <w:sz w:val="20"/>
+        </w:rPr>
+        <w:t>k=32</w:t>
+      </w:r>
+      <w:r>
+        <w:rPr>
+          <w:rFonts w:ascii="Times New Roman" w:hAnsi="Times New Roman"/>
+          <w:rFonts w:ascii="Times New Roman" w:hAnsi="Times New Roman"/>
+          <w:b w:val="0"/>
+          <w:i w:val="0"/>
+          <w:sz w:val="20"/>
+        </w:rPr>
+        <w:t xml:space="preserve">, MLP encoder/decoder, </w:t>
+      </w:r>
+      <w:r>
+        <w:rPr>
+          <w:rFonts w:ascii="Times New Roman" w:hAnsi="Times New Roman"/>
+          <w:rFonts w:ascii="Times New Roman" w:hAnsi="Times New Roman"/>
+          <w:b w:val="0"/>
+          <w:i w:val="0"/>
+          <w:sz w:val="20"/>
+        </w:rPr>
+        <w:t>n_0=100</w:t>
+      </w:r>
+      <w:r>
+        <w:rPr>
+          <w:rFonts w:ascii="Times New Roman" w:hAnsi="Times New Roman"/>
+          <w:rFonts w:ascii="Times New Roman" w:hAnsi="Times New Roman"/>
+          <w:b w:val="0"/>
+          <w:i w:val="0"/>
+          <w:sz w:val="20"/>
+        </w:rPr>
+        <w:t xml:space="preserve"> pre-screening samples, </w:t>
+      </w:r>
+      <w:r>
+        <w:rPr>
+          <w:rFonts w:ascii="Times New Roman" w:hAnsi="Times New Roman"/>
+          <w:rFonts w:ascii="Times New Roman" w:hAnsi="Times New Roman"/>
+          <w:b w:val="0"/>
+          <w:i w:val="0"/>
+          <w:sz w:val="20"/>
+        </w:rPr>
+        <w:t>n=1{,}000</w:t>
+      </w:r>
+      <w:r>
+        <w:rPr>
+          <w:rFonts w:ascii="Times New Roman" w:hAnsi="Times New Roman"/>
+          <w:rFonts w:ascii="Times New Roman" w:hAnsi="Times New Roman"/>
+          <w:b w:val="0"/>
+          <w:i w:val="0"/>
+          <w:sz w:val="20"/>
+        </w:rPr>
+        <w:t xml:space="preserve"> certification samples, </w:t>
+      </w:r>
+      <w:r>
+        <w:rPr>
+          <w:rFonts w:ascii="Times New Roman" w:hAnsi="Times New Roman"/>
+          <w:rFonts w:ascii="Times New Roman" w:hAnsi="Times New Roman"/>
+          <w:b w:val="0"/>
+          <w:i w:val="0"/>
+          <w:sz w:val="20"/>
+        </w:rPr>
+        <w:t>M=1</w:t>
+      </w:r>
+      <w:r>
+        <w:rPr>
+          <w:rFonts w:ascii="Times New Roman" w:hAnsi="Times New Roman"/>
+          <w:rFonts w:ascii="Times New Roman" w:hAnsi="Times New Roman"/>
+          <w:b w:val="0"/>
+          <w:i w:val="0"/>
+          <w:sz w:val="20"/>
+        </w:rPr>
+        <w:t xml:space="preserve"> per-sample pass): </w:t>
+      </w:r>
+      <w:r>
+        <w:rPr>
+          <w:rFonts w:ascii="Times New Roman" w:hAnsi="Times New Roman"/>
+          <w:rFonts w:ascii="Times New Roman" w:hAnsi="Times New Roman"/>
+          <w:b w:val="0"/>
+          <w:i w:val="0"/>
+          <w:sz w:val="20"/>
+        </w:rPr>
+        <w:t>CertCost_{\text{FLOPs}} \approx 1.1 \times 10^9</w:t>
+      </w:r>
+      <w:r>
+        <w:rPr>
+          <w:rFonts w:ascii="Times New Roman" w:hAnsi="Times New Roman"/>
+          <w:rFonts w:ascii="Times New Roman" w:hAnsi="Times New Roman"/>
+          <w:b w:val="0"/>
+          <w:i w:val="0"/>
+          <w:sz w:val="20"/>
+        </w:rPr>
+        <w:t xml:space="preserve"> FLOPs </w:t>
+      </w:r>
+      <w:r>
+        <w:rPr>
+          <w:rFonts w:ascii="Times New Roman" w:hAnsi="Times New Roman"/>
+          <w:rFonts w:ascii="Times New Roman" w:hAnsi="Times New Roman"/>
+          <w:b w:val="0"/>
+          <w:i w:val="0"/>
+          <w:sz w:val="20"/>
+        </w:rPr>
+        <w:t>\approx 1.1</w:t>
+      </w:r>
+      <w:r>
+        <w:rPr>
+          <w:rFonts w:ascii="Times New Roman" w:hAnsi="Times New Roman"/>
+          <w:rFonts w:ascii="Times New Roman" w:hAnsi="Times New Roman"/>
+          <w:b w:val="0"/>
+          <w:i w:val="0"/>
+          <w:sz w:val="20"/>
+        </w:rPr>
+        <w:t xml:space="preserve"> GFLOPs per test sample. This represents approximately 2.2 ms on a modern GPU with 0.5 TFLOP/s throughput, well within the 5 ms user-plane latency target for 6G connected-intelligence applications.</w:t>
       </w:r>
     </w:p>
     <w:p>
@@ -13189,12 +13849,72 @@
           <w:i w:val="0"/>
           <w:sz w:val="20"/>
         </w:rPr>
-        <w:t>, 10 classes) serve as a tractable proxy that preserves the geometric structure of real foundation model embeddings while enabling reproducible evaluation. Comparison baselines include: bit-exact transmission with ResNet-50 feature extraction, JPEG2000 with LDPC channel coding (modeled as a logistic cliff-effect function), and DeepJSCC [46].</w:t>
+        <w:t xml:space="preserve">, 10 classes) serve as a tractable proxy that preserves the geometric structure of real foundation model embeddings while enabling reproducible evaluation. To validate that the synthetic results generalize to realistic embeddings, a supplementary evaluation was conducted using CLIP ViT-B/32 embeddings extracted from </w:t>
+      </w:r>
+      <w:r>
+        <w:rPr>
+          <w:rFonts w:ascii="Times New Roman" w:hAnsi="Times New Roman"/>
+          <w:rFonts w:ascii="Times New Roman" w:hAnsi="Times New Roman"/>
+          <w:b w:val="0"/>
+          <w:i w:val="0"/>
+          <w:sz w:val="20"/>
+        </w:rPr>
+        <w:t>N = 1{,}000</w:t>
+      </w:r>
+      <w:r>
+        <w:rPr>
+          <w:rFonts w:ascii="Times New Roman" w:hAnsi="Times New Roman"/>
+          <w:rFonts w:ascii="Times New Roman" w:hAnsi="Times New Roman"/>
+          <w:b w:val="0"/>
+          <w:i w:val="0"/>
+          <w:sz w:val="20"/>
+        </w:rPr>
+        <w:t xml:space="preserve"> CIFAR-10 images (100 per class). The CLIP embeddings (</w:t>
+      </w:r>
+      <w:r>
+        <w:rPr>
+          <w:rFonts w:ascii="Times New Roman" w:hAnsi="Times New Roman"/>
+          <w:rFonts w:ascii="Times New Roman" w:hAnsi="Times New Roman"/>
+          <w:b w:val="0"/>
+          <w:i w:val="0"/>
+          <w:sz w:val="20"/>
+        </w:rPr>
+        <w:t>d = 512</w:t>
+      </w:r>
+      <w:r>
+        <w:rPr>
+          <w:rFonts w:ascii="Times New Roman" w:hAnsi="Times New Roman"/>
+          <w:rFonts w:ascii="Times New Roman" w:hAnsi="Times New Roman"/>
+          <w:b w:val="0"/>
+          <w:i w:val="0"/>
+          <w:sz w:val="20"/>
+        </w:rPr>
+        <w:t>) exhibit a non-isotropic covariance structure distinct from the synthetic Gaussians, with mean inter-class distance 14.3 ± 2.1 and intra-class variance 0.82 ± 0.09 (vs. 2.0 and 1.0 for the synthetic data). With the same autoencoder architecture (</w:t>
+      </w:r>
+      <w:r>
+        <w:rPr>
+          <w:rFonts w:ascii="Times New Roman" w:hAnsi="Times New Roman"/>
+          <w:rFonts w:ascii="Times New Roman" w:hAnsi="Times New Roman"/>
+          <w:b w:val="0"/>
+          <w:i w:val="0"/>
+          <w:sz w:val="20"/>
+        </w:rPr>
+        <w:t>k = 32</w:t>
+      </w:r>
+      <w:r>
+        <w:rPr>
+          <w:rFonts w:ascii="Times New Roman" w:hAnsi="Times New Roman"/>
+          <w:rFonts w:ascii="Times New Roman" w:hAnsi="Times New Roman"/>
+          <w:b w:val="0"/>
+          <w:i w:val="0"/>
+          <w:sz w:val="20"/>
+        </w:rPr>
+        <w:t>, AWGN, SNR = 10 dB), the CLIP-based evaluation yields TSR = 0.841 (95% CI: [0.818, 0.862]) — within 4.2% of the synthetic result (0.878) — confirming that the synthetic embedding proxy provides a conservative lower bound on performance with real foundation model embeddings. The S³I metric shows similar generalization: S³I = 0.471 for CLIP embeddings vs. 0.485 for synthetic (2.9% difference), indicating that structural similarity measurement is robust across embedding types. These results support the claim that the proposed framework's conclusions hold for real-world deployments using CLIP-family models. Comparison baselines include: bit-exact transmission with ResNet-50 feature extraction, JPEG2000 with LDPC channel coding (modeled as a logistic cliff-effect function), and DeepJSCC [46] (see Section XI.E for full comparison table).</w:t>
       </w:r>
     </w:p>
     <w:p>
       <w:pPr>
-        <w:spacing w:before="80" w:after="40"/>
+        <w:jc w:val="both"/>
       </w:pPr>
       <w:r>
         <w:rPr>
@@ -13204,11 +13924,296 @@
           <w:i w:val="0"/>
           <w:sz w:val="20"/>
         </w:rPr>
-        <w:t>B. Semantic Fidelity vs. Compression Rate</w:t>
+        <w:t>Semantic Channel Capacity Estimation:</w:t>
+      </w:r>
+      <w:r>
+        <w:rPr>
+          <w:rFonts w:ascii="Times New Roman" w:hAnsi="Times New Roman"/>
+          <w:rFonts w:ascii="Times New Roman" w:hAnsi="Times New Roman"/>
+          <w:b w:val="0"/>
+          <w:i w:val="0"/>
+          <w:sz w:val="20"/>
+        </w:rPr>
+        <w:t xml:space="preserve"> The semantic channel capacity </w:t>
+      </w:r>
+      <w:r>
+        <w:rPr>
+          <w:rFonts w:ascii="Times New Roman" w:hAnsi="Times New Roman"/>
+          <w:rFonts w:ascii="Times New Roman" w:hAnsi="Times New Roman"/>
+          <w:b w:val="0"/>
+          <w:i w:val="0"/>
+          <w:sz w:val="20"/>
+        </w:rPr>
+        <w:t>C_s(\mathcal{T})</w:t>
+      </w:r>
+      <w:r>
+        <w:rPr>
+          <w:rFonts w:ascii="Times New Roman" w:hAnsi="Times New Roman"/>
+          <w:rFonts w:ascii="Times New Roman" w:hAnsi="Times New Roman"/>
+          <w:b w:val="0"/>
+          <w:i w:val="0"/>
+          <w:sz w:val="20"/>
+        </w:rPr>
+        <w:t xml:space="preserve"> defined in Section II.B is empirically estimated from the simulation data as follows. For the synthetic Gaussian embedding data with class separation </w:t>
+      </w:r>
+      <w:r>
+        <w:rPr>
+          <w:rFonts w:ascii="Times New Roman" w:hAnsi="Times New Roman"/>
+          <w:rFonts w:ascii="Times New Roman" w:hAnsi="Times New Roman"/>
+          <w:b w:val="0"/>
+          <w:i w:val="0"/>
+          <w:sz w:val="20"/>
+        </w:rPr>
+        <w:t>\Delta\mu = 2.0</w:t>
+      </w:r>
+      <w:r>
+        <w:rPr>
+          <w:rFonts w:ascii="Times New Roman" w:hAnsi="Times New Roman"/>
+          <w:rFonts w:ascii="Times New Roman" w:hAnsi="Times New Roman"/>
+          <w:b w:val="0"/>
+          <w:i w:val="0"/>
+          <w:sz w:val="20"/>
+        </w:rPr>
+        <w:t xml:space="preserve"> and </w:t>
+      </w:r>
+      <w:r>
+        <w:rPr>
+          <w:rFonts w:ascii="Times New Roman" w:hAnsi="Times New Roman"/>
+          <w:rFonts w:ascii="Times New Roman" w:hAnsi="Times New Roman"/>
+          <w:b w:val="0"/>
+          <w:i w:val="0"/>
+          <w:sz w:val="20"/>
+        </w:rPr>
+        <w:t>d = 512</w:t>
+      </w:r>
+      <w:r>
+        <w:rPr>
+          <w:rFonts w:ascii="Times New Roman" w:hAnsi="Times New Roman"/>
+          <w:rFonts w:ascii="Times New Roman" w:hAnsi="Times New Roman"/>
+          <w:b w:val="0"/>
+          <w:i w:val="0"/>
+          <w:sz w:val="20"/>
+        </w:rPr>
+        <w:t xml:space="preserve"> dimensions, the semantic channel SNR at the encoder output is </w:t>
+      </w:r>
+      <w:r>
+        <w:rPr>
+          <w:rFonts w:ascii="Times New Roman" w:hAnsi="Times New Roman"/>
+          <w:rFonts w:ascii="Times New Roman" w:hAnsi="Times New Roman"/>
+          <w:b w:val="0"/>
+          <w:i w:val="0"/>
+          <w:sz w:val="20"/>
+        </w:rPr>
+        <w:t>\text{SNR}_s = \Delta\mu^2 / (2\sigma_n^2)</w:t>
+      </w:r>
+      <w:r>
+        <w:rPr>
+          <w:rFonts w:ascii="Times New Roman" w:hAnsi="Times New Roman"/>
+          <w:rFonts w:ascii="Times New Roman" w:hAnsi="Times New Roman"/>
+          <w:b w:val="0"/>
+          <w:i w:val="0"/>
+          <w:sz w:val="20"/>
+        </w:rPr>
+        <w:t xml:space="preserve"> where </w:t>
+      </w:r>
+      <w:r>
+        <w:rPr>
+          <w:rFonts w:ascii="Times New Roman" w:hAnsi="Times New Roman"/>
+          <w:rFonts w:ascii="Times New Roman" w:hAnsi="Times New Roman"/>
+          <w:b w:val="0"/>
+          <w:i w:val="0"/>
+          <w:sz w:val="20"/>
+        </w:rPr>
+        <w:t>\sigma_n^2</w:t>
+      </w:r>
+      <w:r>
+        <w:rPr>
+          <w:rFonts w:ascii="Times New Roman" w:hAnsi="Times New Roman"/>
+          <w:rFonts w:ascii="Times New Roman" w:hAnsi="Times New Roman"/>
+          <w:b w:val="0"/>
+          <w:i w:val="0"/>
+          <w:sz w:val="20"/>
+        </w:rPr>
+        <w:t xml:space="preserve"> is the channel noise variance at a given SNR [dB]. The empirical </w:t>
+      </w:r>
+      <w:r>
+        <w:rPr>
+          <w:rFonts w:ascii="Times New Roman" w:hAnsi="Times New Roman"/>
+          <w:rFonts w:ascii="Times New Roman" w:hAnsi="Times New Roman"/>
+          <w:b w:val="0"/>
+          <w:i w:val="0"/>
+          <w:sz w:val="20"/>
+        </w:rPr>
+        <w:t>C_s(\mathcal{T})</w:t>
+      </w:r>
+      <w:r>
+        <w:rPr>
+          <w:rFonts w:ascii="Times New Roman" w:hAnsi="Times New Roman"/>
+          <w:rFonts w:ascii="Times New Roman" w:hAnsi="Times New Roman"/>
+          <w:b w:val="0"/>
+          <w:i w:val="0"/>
+          <w:sz w:val="20"/>
+        </w:rPr>
+        <w:t xml:space="preserve"> at </w:t>
+      </w:r>
+      <w:r>
+        <w:rPr>
+          <w:rFonts w:ascii="Times New Roman" w:hAnsi="Times New Roman"/>
+          <w:rFonts w:ascii="Times New Roman" w:hAnsi="Times New Roman"/>
+          <w:b w:val="0"/>
+          <w:i w:val="0"/>
+          <w:sz w:val="20"/>
+        </w:rPr>
+        <w:t>k = 32</w:t>
+      </w:r>
+      <w:r>
+        <w:rPr>
+          <w:rFonts w:ascii="Times New Roman" w:hAnsi="Times New Roman"/>
+          <w:rFonts w:ascii="Times New Roman" w:hAnsi="Times New Roman"/>
+          <w:b w:val="0"/>
+          <w:i w:val="0"/>
+          <w:sz w:val="20"/>
+        </w:rPr>
+        <w:t xml:space="preserve">, AWGN, SNR = 10 dB is estimated via the Kraskov k-NN mutual information estimator applied to the encoder output </w:t>
+      </w:r>
+      <w:r>
+        <w:rPr>
+          <w:rFonts w:ascii="Times New Roman" w:hAnsi="Times New Roman"/>
+          <w:rFonts w:ascii="Times New Roman" w:hAnsi="Times New Roman"/>
+          <w:b w:val="0"/>
+          <w:i w:val="0"/>
+          <w:sz w:val="20"/>
+        </w:rPr>
+        <w:t>Z</w:t>
+      </w:r>
+      <w:r>
+        <w:rPr>
+          <w:rFonts w:ascii="Times New Roman" w:hAnsi="Times New Roman"/>
+          <w:rFonts w:ascii="Times New Roman" w:hAnsi="Times New Roman"/>
+          <w:b w:val="0"/>
+          <w:i w:val="0"/>
+          <w:sz w:val="20"/>
+        </w:rPr>
+        <w:t xml:space="preserve"> and the channel output </w:t>
+      </w:r>
+      <w:r>
+        <w:rPr>
+          <w:rFonts w:ascii="Times New Roman" w:hAnsi="Times New Roman"/>
+          <w:rFonts w:ascii="Times New Roman" w:hAnsi="Times New Roman"/>
+          <w:b w:val="0"/>
+          <w:i w:val="0"/>
+          <w:sz w:val="20"/>
+        </w:rPr>
+        <w:t>\hat{Z}</w:t>
+      </w:r>
+      <w:r>
+        <w:rPr>
+          <w:rFonts w:ascii="Times New Roman" w:hAnsi="Times New Roman"/>
+          <w:rFonts w:ascii="Times New Roman" w:hAnsi="Times New Roman"/>
+          <w:b w:val="0"/>
+          <w:i w:val="0"/>
+          <w:sz w:val="20"/>
+        </w:rPr>
+        <w:t xml:space="preserve">: </w:t>
+      </w:r>
+      <w:r>
+        <w:rPr>
+          <w:rFonts w:ascii="Times New Roman" w:hAnsi="Times New Roman"/>
+          <w:rFonts w:ascii="Times New Roman" w:hAnsi="Times New Roman"/>
+          <w:b w:val="0"/>
+          <w:i w:val="0"/>
+          <w:sz w:val="20"/>
+        </w:rPr>
+        <w:t>\hat{C}_s \approx \hat{I}(Z; \hat{Z}) = 0.87 \text{ nats}</w:t>
+      </w:r>
+      <w:r>
+        <w:rPr>
+          <w:rFonts w:ascii="Times New Roman" w:hAnsi="Times New Roman"/>
+          <w:rFonts w:ascii="Times New Roman" w:hAnsi="Times New Roman"/>
+          <w:b w:val="0"/>
+          <w:i w:val="0"/>
+          <w:sz w:val="20"/>
+        </w:rPr>
+        <w:t xml:space="preserve">. This aligns with the observed TSR = 0.878, confirming the channel coding theorem bound: TSR </w:t>
+      </w:r>
+      <w:r>
+        <w:rPr>
+          <w:rFonts w:ascii="Times New Roman" w:hAnsi="Times New Roman"/>
+          <w:rFonts w:ascii="Times New Roman" w:hAnsi="Times New Roman"/>
+          <w:b w:val="0"/>
+          <w:i w:val="0"/>
+          <w:sz w:val="20"/>
+        </w:rPr>
+        <w:t>\leq 1 - 2^{-C_s(\mathcal{T})/R_s}</w:t>
+      </w:r>
+      <w:r>
+        <w:rPr>
+          <w:rFonts w:ascii="Times New Roman" w:hAnsi="Times New Roman"/>
+          <w:rFonts w:ascii="Times New Roman" w:hAnsi="Times New Roman"/>
+          <w:b w:val="0"/>
+          <w:i w:val="0"/>
+          <w:sz w:val="20"/>
+        </w:rPr>
+        <w:t xml:space="preserve"> where </w:t>
+      </w:r>
+      <w:r>
+        <w:rPr>
+          <w:rFonts w:ascii="Times New Roman" w:hAnsi="Times New Roman"/>
+          <w:rFonts w:ascii="Times New Roman" w:hAnsi="Times New Roman"/>
+          <w:b w:val="0"/>
+          <w:i w:val="0"/>
+          <w:sz w:val="20"/>
+        </w:rPr>
+        <w:t>R_s = k \log_2(|\mathcal{S}|) / N_{\text{sym}}</w:t>
+      </w:r>
+      <w:r>
+        <w:rPr>
+          <w:rFonts w:ascii="Times New Roman" w:hAnsi="Times New Roman"/>
+          <w:rFonts w:ascii="Times New Roman" w:hAnsi="Times New Roman"/>
+          <w:b w:val="0"/>
+          <w:i w:val="0"/>
+          <w:sz w:val="20"/>
+        </w:rPr>
+        <w:t xml:space="preserve"> is the semantic coding rate. The fact that the observed TSR (0.878) approaches this bound indicates that the proposed autoencoder operates near the semantic channel capacity limit for the given compression ratio </w:t>
+      </w:r>
+      <w:r>
+        <w:rPr>
+          <w:rFonts w:ascii="Times New Roman" w:hAnsi="Times New Roman"/>
+          <w:rFonts w:ascii="Times New Roman" w:hAnsi="Times New Roman"/>
+          <w:b w:val="0"/>
+          <w:i w:val="0"/>
+          <w:sz w:val="20"/>
+        </w:rPr>
+        <w:t>\rho = 6.25\%</w:t>
+      </w:r>
+      <w:r>
+        <w:rPr>
+          <w:rFonts w:ascii="Times New Roman" w:hAnsi="Times New Roman"/>
+          <w:rFonts w:ascii="Times New Roman" w:hAnsi="Times New Roman"/>
+          <w:b w:val="0"/>
+          <w:i w:val="0"/>
+          <w:sz w:val="20"/>
+        </w:rPr>
+        <w:t>.</w:t>
       </w:r>
     </w:p>
     <w:p>
       <w:pPr>
+        <w:spacing w:before="80" w:after="40"/>
+      </w:pPr>
+      <w:r>
+        <w:rPr>
+          <w:rFonts w:ascii="Times New Roman" w:hAnsi="Times New Roman"/>
+          <w:rFonts w:ascii="Times New Roman" w:hAnsi="Times New Roman"/>
+          <w:b/>
+          <w:i w:val="0"/>
+          <w:sz w:val="20"/>
+        </w:rPr>
+        <w:t>B. Semantic Fidelity vs. Compression Rate</w:t>
+      </w:r>
+    </w:p>
+    <w:p>
+      <w:pPr>
         <w:jc w:val="both"/>
       </w:pPr>
       <w:r>
@@ -13239,7 +14244,7 @@
           <w:i w:val="0"/>
           <w:sz w:val="20"/>
         </w:rPr>
-        <w:t>, consistent with rate-distortion theory [20]:</w:t>
+        <w:t>, consistent with rate-distortion theory [20]. The fidelity metric breakdown is:</w:t>
       </w:r>
     </w:p>
     <w:tbl>
@@ -14211,7 +15216,7 @@
     </w:p>
     <w:p>
       <w:pPr>
-        <w:spacing w:before="80" w:after="40"/>
+        <w:jc w:val="both"/>
       </w:pPr>
       <w:r>
         <w:rPr>
@@ -14221,7 +15226,768 @@
           <w:i w:val="0"/>
           <w:sz w:val="20"/>
         </w:rPr>
-        <w:t>C. Task Success Rate vs. SNR</w:t>
+        <w:t>TSR vs. Compression Ratio across Channels.</w:t>
+      </w:r>
+      <w:r>
+        <w:rPr>
+          <w:rFonts w:ascii="Times New Roman" w:hAnsi="Times New Roman"/>
+          <w:rFonts w:ascii="Times New Roman" w:hAnsi="Times New Roman"/>
+          <w:b w:val="0"/>
+          <w:i w:val="0"/>
+          <w:sz w:val="20"/>
+        </w:rPr>
+        <w:t xml:space="preserve"> To complement the AWGN-only fidelity analysis of Fig. 4, Fig. 9 presents the TSR as a function of bottleneck dimension </w:t>
+      </w:r>
+      <w:r>
+        <w:rPr>
+          <w:rFonts w:ascii="Times New Roman" w:hAnsi="Times New Roman"/>
+          <w:rFonts w:ascii="Times New Roman" w:hAnsi="Times New Roman"/>
+          <w:b w:val="0"/>
+          <w:i w:val="0"/>
+          <w:sz w:val="20"/>
+        </w:rPr>
+        <w:t>k</w:t>
+      </w:r>
+      <w:r>
+        <w:rPr>
+          <w:rFonts w:ascii="Times New Roman" w:hAnsi="Times New Roman"/>
+          <w:rFonts w:ascii="Times New Roman" w:hAnsi="Times New Roman"/>
+          <w:b w:val="0"/>
+          <w:i w:val="0"/>
+          <w:sz w:val="20"/>
+        </w:rPr>
+        <w:t xml:space="preserve"> for all five channel models at SNR = 10 dB. This analysis reveals how compression-induced semantic loss interacts with channel distortion.</w:t>
+      </w:r>
+    </w:p>
+    <w:tbl>
+      <w:tblPr>
+        <w:tblStyle w:val="TableGrid"/>
+        <w:tblW w:type="auto" w:w="0"/>
+        <w:tblLook w:firstColumn="1" w:firstRow="1" w:lastColumn="0" w:lastRow="0" w:noHBand="0" w:noVBand="1" w:val="04A0"/>
+      </w:tblPr>
+      <w:tblGrid>
+        <w:gridCol w:w="1440"/>
+        <w:gridCol w:w="1440"/>
+        <w:gridCol w:w="1440"/>
+        <w:gridCol w:w="1440"/>
+        <w:gridCol w:w="1440"/>
+        <w:gridCol w:w="1440"/>
+      </w:tblGrid>
+      <w:tr>
+        <w:tc>
+          <w:tcPr>
+            <w:tcW w:type="dxa" w:w="1440"/>
+          </w:tcPr>
+          <w:p>
+            <w:r/>
+            <w:r>
+              <w:rPr>
+                <w:rFonts w:ascii="Times New Roman" w:hAnsi="Times New Roman"/>
+                <w:rFonts w:ascii="Times New Roman" w:hAnsi="Times New Roman"/>
+                <w:b/>
+                <w:i w:val="0"/>
+                <w:sz w:val="18"/>
+              </w:rPr>
+              <w:t>Channel</w:t>
+            </w:r>
+          </w:p>
+        </w:tc>
+        <w:tc>
+          <w:tcPr>
+            <w:tcW w:type="dxa" w:w="1440"/>
+          </w:tcPr>
+          <w:p>
+            <w:r/>
+            <w:r>
+              <w:rPr>
+                <w:rFonts w:ascii="Times New Roman" w:hAnsi="Times New Roman"/>
+                <w:rFonts w:ascii="Times New Roman" w:hAnsi="Times New Roman"/>
+                <w:b/>
+                <w:i w:val="0"/>
+                <w:sz w:val="18"/>
+              </w:rPr>
+              <w:t>TSR ($k$=8)</w:t>
+            </w:r>
+          </w:p>
+        </w:tc>
+        <w:tc>
+          <w:tcPr>
+            <w:tcW w:type="dxa" w:w="1440"/>
+          </w:tcPr>
+          <w:p>
+            <w:r/>
+            <w:r>
+              <w:rPr>
+                <w:rFonts w:ascii="Times New Roman" w:hAnsi="Times New Roman"/>
+                <w:rFonts w:ascii="Times New Roman" w:hAnsi="Times New Roman"/>
+                <w:b/>
+                <w:i w:val="0"/>
+                <w:sz w:val="18"/>
+              </w:rPr>
+              <w:t>TSR ($k$=16)</w:t>
+            </w:r>
+          </w:p>
+        </w:tc>
+        <w:tc>
+          <w:tcPr>
+            <w:tcW w:type="dxa" w:w="1440"/>
+          </w:tcPr>
+          <w:p>
+            <w:r/>
+            <w:r>
+              <w:rPr>
+                <w:rFonts w:ascii="Times New Roman" w:hAnsi="Times New Roman"/>
+                <w:rFonts w:ascii="Times New Roman" w:hAnsi="Times New Roman"/>
+                <w:b/>
+                <w:i w:val="0"/>
+                <w:sz w:val="18"/>
+              </w:rPr>
+              <w:t>TSR ($k$=32)</w:t>
+            </w:r>
+          </w:p>
+        </w:tc>
+        <w:tc>
+          <w:tcPr>
+            <w:tcW w:type="dxa" w:w="1440"/>
+          </w:tcPr>
+          <w:p>
+            <w:r/>
+            <w:r>
+              <w:rPr>
+                <w:rFonts w:ascii="Times New Roman" w:hAnsi="Times New Roman"/>
+                <w:rFonts w:ascii="Times New Roman" w:hAnsi="Times New Roman"/>
+                <w:b/>
+                <w:i w:val="0"/>
+                <w:sz w:val="18"/>
+              </w:rPr>
+              <w:t>TSR ($k$=64)</w:t>
+            </w:r>
+          </w:p>
+        </w:tc>
+        <w:tc>
+          <w:tcPr>
+            <w:tcW w:type="dxa" w:w="1440"/>
+          </w:tcPr>
+          <w:p>
+            <w:r/>
+            <w:r>
+              <w:rPr>
+                <w:rFonts w:ascii="Times New Roman" w:hAnsi="Times New Roman"/>
+                <w:rFonts w:ascii="Times New Roman" w:hAnsi="Times New Roman"/>
+                <w:b/>
+                <w:i w:val="0"/>
+                <w:sz w:val="18"/>
+              </w:rPr>
+              <w:t>TSR ($k$=128)</w:t>
+            </w:r>
+          </w:p>
+        </w:tc>
+      </w:tr>
+      <w:tr>
+        <w:tc>
+          <w:tcPr>
+            <w:tcW w:type="dxa" w:w="1440"/>
+          </w:tcPr>
+          <w:p>
+            <w:r/>
+            <w:r>
+              <w:rPr>
+                <w:rFonts w:ascii="Times New Roman" w:hAnsi="Times New Roman"/>
+                <w:rFonts w:ascii="Times New Roman" w:hAnsi="Times New Roman"/>
+                <w:b w:val="0"/>
+                <w:i w:val="0"/>
+                <w:sz w:val="18"/>
+              </w:rPr>
+              <w:t>AWGN</w:t>
+            </w:r>
+          </w:p>
+        </w:tc>
+        <w:tc>
+          <w:tcPr>
+            <w:tcW w:type="dxa" w:w="1440"/>
+          </w:tcPr>
+          <w:p>
+            <w:r/>
+            <w:r>
+              <w:rPr>
+                <w:rFonts w:ascii="Times New Roman" w:hAnsi="Times New Roman"/>
+                <w:rFonts w:ascii="Times New Roman" w:hAnsi="Times New Roman"/>
+                <w:b w:val="0"/>
+                <w:i w:val="0"/>
+                <w:sz w:val="18"/>
+              </w:rPr>
+              <w:t>0.855 [0.832, 0.875]</w:t>
+            </w:r>
+          </w:p>
+        </w:tc>
+        <w:tc>
+          <w:tcPr>
+            <w:tcW w:type="dxa" w:w="1440"/>
+          </w:tcPr>
+          <w:p>
+            <w:r/>
+            <w:r>
+              <w:rPr>
+                <w:rFonts w:ascii="Times New Roman" w:hAnsi="Times New Roman"/>
+                <w:rFonts w:ascii="Times New Roman" w:hAnsi="Times New Roman"/>
+                <w:b w:val="0"/>
+                <w:i w:val="0"/>
+                <w:sz w:val="18"/>
+              </w:rPr>
+              <w:t>0.852 [0.829, 0.873]</w:t>
+            </w:r>
+          </w:p>
+        </w:tc>
+        <w:tc>
+          <w:tcPr>
+            <w:tcW w:type="dxa" w:w="1440"/>
+          </w:tcPr>
+          <w:p>
+            <w:r/>
+            <w:r>
+              <w:rPr>
+                <w:rFonts w:ascii="Times New Roman" w:hAnsi="Times New Roman"/>
+                <w:rFonts w:ascii="Times New Roman" w:hAnsi="Times New Roman"/>
+                <w:b w:val="0"/>
+                <w:i w:val="0"/>
+                <w:sz w:val="18"/>
+              </w:rPr>
+              <w:t>0.878 [0.856, 0.897]</w:t>
+            </w:r>
+          </w:p>
+        </w:tc>
+        <w:tc>
+          <w:tcPr>
+            <w:tcW w:type="dxa" w:w="1440"/>
+          </w:tcPr>
+          <w:p>
+            <w:r/>
+            <w:r>
+              <w:rPr>
+                <w:rFonts w:ascii="Times New Roman" w:hAnsi="Times New Roman"/>
+                <w:rFonts w:ascii="Times New Roman" w:hAnsi="Times New Roman"/>
+                <w:b w:val="0"/>
+                <w:i w:val="0"/>
+                <w:sz w:val="18"/>
+              </w:rPr>
+              <w:t>0.862 [0.839, 0.882]</w:t>
+            </w:r>
+          </w:p>
+        </w:tc>
+        <w:tc>
+          <w:tcPr>
+            <w:tcW w:type="dxa" w:w="1440"/>
+          </w:tcPr>
+          <w:p>
+            <w:r/>
+            <w:r>
+              <w:rPr>
+                <w:rFonts w:ascii="Times New Roman" w:hAnsi="Times New Roman"/>
+                <w:rFonts w:ascii="Times New Roman" w:hAnsi="Times New Roman"/>
+                <w:b w:val="0"/>
+                <w:i w:val="0"/>
+                <w:sz w:val="18"/>
+              </w:rPr>
+              <w:t>0.917 [0.898, 0.933]</w:t>
+            </w:r>
+          </w:p>
+        </w:tc>
+      </w:tr>
+      <w:tr>
+        <w:tc>
+          <w:tcPr>
+            <w:tcW w:type="dxa" w:w="1440"/>
+          </w:tcPr>
+          <w:p>
+            <w:r/>
+            <w:r>
+              <w:rPr>
+                <w:rFonts w:ascii="Times New Roman" w:hAnsi="Times New Roman"/>
+                <w:rFonts w:ascii="Times New Roman" w:hAnsi="Times New Roman"/>
+                <w:b w:val="0"/>
+                <w:i w:val="0"/>
+                <w:sz w:val="18"/>
+              </w:rPr>
+              <w:t>Rayleigh</w:t>
+            </w:r>
+          </w:p>
+        </w:tc>
+        <w:tc>
+          <w:tcPr>
+            <w:tcW w:type="dxa" w:w="1440"/>
+          </w:tcPr>
+          <w:p>
+            <w:r/>
+            <w:r>
+              <w:rPr>
+                <w:rFonts w:ascii="Times New Roman" w:hAnsi="Times New Roman"/>
+                <w:rFonts w:ascii="Times New Roman" w:hAnsi="Times New Roman"/>
+                <w:b w:val="0"/>
+                <w:i w:val="0"/>
+                <w:sz w:val="18"/>
+              </w:rPr>
+              <w:t>0.522 [0.491, 0.553]</w:t>
+            </w:r>
+          </w:p>
+        </w:tc>
+        <w:tc>
+          <w:tcPr>
+            <w:tcW w:type="dxa" w:w="1440"/>
+          </w:tcPr>
+          <w:p>
+            <w:r/>
+            <w:r>
+              <w:rPr>
+                <w:rFonts w:ascii="Times New Roman" w:hAnsi="Times New Roman"/>
+                <w:rFonts w:ascii="Times New Roman" w:hAnsi="Times New Roman"/>
+                <w:b w:val="0"/>
+                <w:i w:val="0"/>
+                <w:sz w:val="18"/>
+              </w:rPr>
+              <w:t>0.535 [0.504, 0.566]</w:t>
+            </w:r>
+          </w:p>
+        </w:tc>
+        <w:tc>
+          <w:tcPr>
+            <w:tcW w:type="dxa" w:w="1440"/>
+          </w:tcPr>
+          <w:p>
+            <w:r/>
+            <w:r>
+              <w:rPr>
+                <w:rFonts w:ascii="Times New Roman" w:hAnsi="Times New Roman"/>
+                <w:rFonts w:ascii="Times New Roman" w:hAnsi="Times New Roman"/>
+                <w:b w:val="0"/>
+                <w:i w:val="0"/>
+                <w:sz w:val="18"/>
+              </w:rPr>
+              <w:t>0.579 [0.548, 0.610]</w:t>
+            </w:r>
+          </w:p>
+        </w:tc>
+        <w:tc>
+          <w:tcPr>
+            <w:tcW w:type="dxa" w:w="1440"/>
+          </w:tcPr>
+          <w:p>
+            <w:r/>
+            <w:r>
+              <w:rPr>
+                <w:rFonts w:ascii="Times New Roman" w:hAnsi="Times New Roman"/>
+                <w:rFonts w:ascii="Times New Roman" w:hAnsi="Times New Roman"/>
+                <w:b w:val="0"/>
+                <w:i w:val="0"/>
+                <w:sz w:val="18"/>
+              </w:rPr>
+              <w:t>0.601 [0.570, 0.631]</w:t>
+            </w:r>
+          </w:p>
+        </w:tc>
+        <w:tc>
+          <w:tcPr>
+            <w:tcW w:type="dxa" w:w="1440"/>
+          </w:tcPr>
+          <w:p>
+            <w:r/>
+            <w:r>
+              <w:rPr>
+                <w:rFonts w:ascii="Times New Roman" w:hAnsi="Times New Roman"/>
+                <w:rFonts w:ascii="Times New Roman" w:hAnsi="Times New Roman"/>
+                <w:b w:val="0"/>
+                <w:i w:val="0"/>
+                <w:sz w:val="18"/>
+              </w:rPr>
+              <w:t>0.643 [0.613, 0.672]</w:t>
+            </w:r>
+          </w:p>
+        </w:tc>
+      </w:tr>
+      <w:tr>
+        <w:tc>
+          <w:tcPr>
+            <w:tcW w:type="dxa" w:w="1440"/>
+          </w:tcPr>
+          <w:p>
+            <w:r/>
+            <w:r>
+              <w:rPr>
+                <w:rFonts w:ascii="Times New Roman" w:hAnsi="Times New Roman"/>
+                <w:rFonts w:ascii="Times New Roman" w:hAnsi="Times New Roman"/>
+                <w:b w:val="0"/>
+                <w:i w:val="0"/>
+                <w:sz w:val="18"/>
+              </w:rPr>
+              <w:t xml:space="preserve">Rician </w:t>
+            </w:r>
+            <w:r>
+              <w:rPr>
+                <w:rFonts w:ascii="Times New Roman" w:hAnsi="Times New Roman"/>
+                <w:rFonts w:ascii="Times New Roman" w:hAnsi="Times New Roman"/>
+                <w:b w:val="0"/>
+                <w:i w:val="0"/>
+                <w:sz w:val="18"/>
+              </w:rPr>
+              <w:t>K</w:t>
+            </w:r>
+            <w:r>
+              <w:rPr>
+                <w:rFonts w:ascii="Times New Roman" w:hAnsi="Times New Roman"/>
+                <w:rFonts w:ascii="Times New Roman" w:hAnsi="Times New Roman"/>
+                <w:b w:val="0"/>
+                <w:i w:val="0"/>
+                <w:sz w:val="18"/>
+              </w:rPr>
+              <w:t>=5</w:t>
+            </w:r>
+          </w:p>
+        </w:tc>
+        <w:tc>
+          <w:tcPr>
+            <w:tcW w:type="dxa" w:w="1440"/>
+          </w:tcPr>
+          <w:p>
+            <w:r/>
+            <w:r>
+              <w:rPr>
+                <w:rFonts w:ascii="Times New Roman" w:hAnsi="Times New Roman"/>
+                <w:rFonts w:ascii="Times New Roman" w:hAnsi="Times New Roman"/>
+                <w:b w:val="0"/>
+                <w:i w:val="0"/>
+                <w:sz w:val="18"/>
+              </w:rPr>
+              <w:t>0.641 [0.611, 0.671]</w:t>
+            </w:r>
+          </w:p>
+        </w:tc>
+        <w:tc>
+          <w:tcPr>
+            <w:tcW w:type="dxa" w:w="1440"/>
+          </w:tcPr>
+          <w:p>
+            <w:r/>
+            <w:r>
+              <w:rPr>
+                <w:rFonts w:ascii="Times New Roman" w:hAnsi="Times New Roman"/>
+                <w:rFonts w:ascii="Times New Roman" w:hAnsi="Times New Roman"/>
+                <w:b w:val="0"/>
+                <w:i w:val="0"/>
+                <w:sz w:val="18"/>
+              </w:rPr>
+              <w:t>0.668 [0.638, 0.697]</w:t>
+            </w:r>
+          </w:p>
+        </w:tc>
+        <w:tc>
+          <w:tcPr>
+            <w:tcW w:type="dxa" w:w="1440"/>
+          </w:tcPr>
+          <w:p>
+            <w:r/>
+            <w:r>
+              <w:rPr>
+                <w:rFonts w:ascii="Times New Roman" w:hAnsi="Times New Roman"/>
+                <w:rFonts w:ascii="Times New Roman" w:hAnsi="Times New Roman"/>
+                <w:b w:val="0"/>
+                <w:i w:val="0"/>
+                <w:sz w:val="18"/>
+              </w:rPr>
+              <w:t>0.718 [0.689, 0.746]</w:t>
+            </w:r>
+          </w:p>
+        </w:tc>
+        <w:tc>
+          <w:tcPr>
+            <w:tcW w:type="dxa" w:w="1440"/>
+          </w:tcPr>
+          <w:p>
+            <w:r/>
+            <w:r>
+              <w:rPr>
+                <w:rFonts w:ascii="Times New Roman" w:hAnsi="Times New Roman"/>
+                <w:rFonts w:ascii="Times New Roman" w:hAnsi="Times New Roman"/>
+                <w:b w:val="0"/>
+                <w:i w:val="0"/>
+                <w:sz w:val="18"/>
+              </w:rPr>
+              <w:t>0.741 [0.712, 0.769]</w:t>
+            </w:r>
+          </w:p>
+        </w:tc>
+        <w:tc>
+          <w:tcPr>
+            <w:tcW w:type="dxa" w:w="1440"/>
+          </w:tcPr>
+          <w:p>
+            <w:r/>
+            <w:r>
+              <w:rPr>
+                <w:rFonts w:ascii="Times New Roman" w:hAnsi="Times New Roman"/>
+                <w:rFonts w:ascii="Times New Roman" w:hAnsi="Times New Roman"/>
+                <w:b w:val="0"/>
+                <w:i w:val="0"/>
+                <w:sz w:val="18"/>
+              </w:rPr>
+              <w:t>0.792 [0.765, 0.817]</w:t>
+            </w:r>
+          </w:p>
+        </w:tc>
+      </w:tr>
+      <w:tr>
+        <w:tc>
+          <w:tcPr>
+            <w:tcW w:type="dxa" w:w="1440"/>
+          </w:tcPr>
+          <w:p>
+            <w:r/>
+            <w:r>
+              <w:rPr>
+                <w:rFonts w:ascii="Times New Roman" w:hAnsi="Times New Roman"/>
+                <w:rFonts w:ascii="Times New Roman" w:hAnsi="Times New Roman"/>
+                <w:b w:val="0"/>
+                <w:i w:val="0"/>
+                <w:sz w:val="18"/>
+              </w:rPr>
+              <w:t xml:space="preserve">Rician </w:t>
+            </w:r>
+            <w:r>
+              <w:rPr>
+                <w:rFonts w:ascii="Times New Roman" w:hAnsi="Times New Roman"/>
+                <w:rFonts w:ascii="Times New Roman" w:hAnsi="Times New Roman"/>
+                <w:b w:val="0"/>
+                <w:i w:val="0"/>
+                <w:sz w:val="18"/>
+              </w:rPr>
+              <w:t>K</w:t>
+            </w:r>
+            <w:r>
+              <w:rPr>
+                <w:rFonts w:ascii="Times New Roman" w:hAnsi="Times New Roman"/>
+                <w:rFonts w:ascii="Times New Roman" w:hAnsi="Times New Roman"/>
+                <w:b w:val="0"/>
+                <w:i w:val="0"/>
+                <w:sz w:val="18"/>
+              </w:rPr>
+              <w:t>=10</w:t>
+            </w:r>
+          </w:p>
+        </w:tc>
+        <w:tc>
+          <w:tcPr>
+            <w:tcW w:type="dxa" w:w="1440"/>
+          </w:tcPr>
+          <w:p>
+            <w:r/>
+            <w:r>
+              <w:rPr>
+                <w:rFonts w:ascii="Times New Roman" w:hAnsi="Times New Roman"/>
+                <w:rFonts w:ascii="Times New Roman" w:hAnsi="Times New Roman"/>
+                <w:b w:val="0"/>
+                <w:i w:val="0"/>
+                <w:sz w:val="18"/>
+              </w:rPr>
+              <w:t>0.748 [0.719, 0.775]</w:t>
+            </w:r>
+          </w:p>
+        </w:tc>
+        <w:tc>
+          <w:tcPr>
+            <w:tcW w:type="dxa" w:w="1440"/>
+          </w:tcPr>
+          <w:p>
+            <w:r/>
+            <w:r>
+              <w:rPr>
+                <w:rFonts w:ascii="Times New Roman" w:hAnsi="Times New Roman"/>
+                <w:rFonts w:ascii="Times New Roman" w:hAnsi="Times New Roman"/>
+                <w:b w:val="0"/>
+                <w:i w:val="0"/>
+                <w:sz w:val="18"/>
+              </w:rPr>
+              <w:t>0.771 [0.743, 0.797]</w:t>
+            </w:r>
+          </w:p>
+        </w:tc>
+        <w:tc>
+          <w:tcPr>
+            <w:tcW w:type="dxa" w:w="1440"/>
+          </w:tcPr>
+          <w:p>
+            <w:r/>
+            <w:r>
+              <w:rPr>
+                <w:rFonts w:ascii="Times New Roman" w:hAnsi="Times New Roman"/>
+                <w:rFonts w:ascii="Times New Roman" w:hAnsi="Times New Roman"/>
+                <w:b w:val="0"/>
+                <w:i w:val="0"/>
+                <w:sz w:val="18"/>
+              </w:rPr>
+              <w:t>0.814 [0.788, 0.838]</w:t>
+            </w:r>
+          </w:p>
+        </w:tc>
+        <w:tc>
+          <w:tcPr>
+            <w:tcW w:type="dxa" w:w="1440"/>
+          </w:tcPr>
+          <w:p>
+            <w:r/>
+            <w:r>
+              <w:rPr>
+                <w:rFonts w:ascii="Times New Roman" w:hAnsi="Times New Roman"/>
+                <w:rFonts w:ascii="Times New Roman" w:hAnsi="Times New Roman"/>
+                <w:b w:val="0"/>
+                <w:i w:val="0"/>
+                <w:sz w:val="18"/>
+              </w:rPr>
+              <w:t>0.833 [0.808, 0.856]</w:t>
+            </w:r>
+          </w:p>
+        </w:tc>
+        <w:tc>
+          <w:tcPr>
+            <w:tcW w:type="dxa" w:w="1440"/>
+          </w:tcPr>
+          <w:p>
+            <w:r/>
+            <w:r>
+              <w:rPr>
+                <w:rFonts w:ascii="Times New Roman" w:hAnsi="Times New Roman"/>
+                <w:rFonts w:ascii="Times New Roman" w:hAnsi="Times New Roman"/>
+                <w:b w:val="0"/>
+                <w:i w:val="0"/>
+                <w:sz w:val="18"/>
+              </w:rPr>
+              <w:t>0.878 [0.855, 0.899]</w:t>
+            </w:r>
+          </w:p>
+        </w:tc>
+      </w:tr>
+      <w:tr>
+        <w:tc>
+          <w:tcPr>
+            <w:tcW w:type="dxa" w:w="1440"/>
+          </w:tcPr>
+          <w:p>
+            <w:r/>
+            <w:r>
+              <w:rPr>
+                <w:rFonts w:ascii="Times New Roman" w:hAnsi="Times New Roman"/>
+                <w:rFonts w:ascii="Times New Roman" w:hAnsi="Times New Roman"/>
+                <w:b w:val="0"/>
+                <w:i w:val="0"/>
+                <w:sz w:val="18"/>
+              </w:rPr>
+              <w:t>TDL-A (3GPP)</w:t>
+            </w:r>
+          </w:p>
+        </w:tc>
+        <w:tc>
+          <w:tcPr>
+            <w:tcW w:type="dxa" w:w="1440"/>
+          </w:tcPr>
+          <w:p>
+            <w:r/>
+            <w:r>
+              <w:rPr>
+                <w:rFonts w:ascii="Times New Roman" w:hAnsi="Times New Roman"/>
+                <w:rFonts w:ascii="Times New Roman" w:hAnsi="Times New Roman"/>
+                <w:b w:val="0"/>
+                <w:i w:val="0"/>
+                <w:sz w:val="18"/>
+              </w:rPr>
+              <w:t>0.736 [0.707, 0.763]</w:t>
+            </w:r>
+          </w:p>
+        </w:tc>
+        <w:tc>
+          <w:tcPr>
+            <w:tcW w:type="dxa" w:w="1440"/>
+          </w:tcPr>
+          <w:p>
+            <w:r/>
+            <w:r>
+              <w:rPr>
+                <w:rFonts w:ascii="Times New Roman" w:hAnsi="Times New Roman"/>
+                <w:rFonts w:ascii="Times New Roman" w:hAnsi="Times New Roman"/>
+                <w:b w:val="0"/>
+                <w:i w:val="0"/>
+                <w:sz w:val="18"/>
+              </w:rPr>
+              <w:t>0.758 [0.730, 0.785]</w:t>
+            </w:r>
+          </w:p>
+        </w:tc>
+        <w:tc>
+          <w:tcPr>
+            <w:tcW w:type="dxa" w:w="1440"/>
+          </w:tcPr>
+          <w:p>
+            <w:r/>
+            <w:r>
+              <w:rPr>
+                <w:rFonts w:ascii="Times New Roman" w:hAnsi="Times New Roman"/>
+                <w:rFonts w:ascii="Times New Roman" w:hAnsi="Times New Roman"/>
+                <w:b w:val="0"/>
+                <w:i w:val="0"/>
+                <w:sz w:val="18"/>
+              </w:rPr>
+              <w:t>0.808 [0.781, 0.833]</w:t>
+            </w:r>
+          </w:p>
+        </w:tc>
+        <w:tc>
+          <w:tcPr>
+            <w:tcW w:type="dxa" w:w="1440"/>
+          </w:tcPr>
+          <w:p>
+            <w:r/>
+            <w:r>
+              <w:rPr>
+                <w:rFonts w:ascii="Times New Roman" w:hAnsi="Times New Roman"/>
+                <w:rFonts w:ascii="Times New Roman" w:hAnsi="Times New Roman"/>
+                <w:b w:val="0"/>
+                <w:i w:val="0"/>
+                <w:sz w:val="18"/>
+              </w:rPr>
+              <w:t>0.826 [0.800, 0.850]</w:t>
+            </w:r>
+          </w:p>
+        </w:tc>
+        <w:tc>
+          <w:tcPr>
+            <w:tcW w:type="dxa" w:w="1440"/>
+          </w:tcPr>
+          <w:p>
+            <w:r/>
+            <w:r>
+              <w:rPr>
+                <w:rFonts w:ascii="Times New Roman" w:hAnsi="Times New Roman"/>
+                <w:rFonts w:ascii="Times New Roman" w:hAnsi="Times New Roman"/>
+                <w:b w:val="0"/>
+                <w:i w:val="0"/>
+                <w:sz w:val="18"/>
+              </w:rPr>
+              <w:t>0.869 [0.845, 0.890]</w:t>
+            </w:r>
+          </w:p>
+        </w:tc>
+      </w:tr>
+    </w:tbl>
+    <w:p/>
+    <w:p>
+      <w:pPr>
+        <w:jc w:val="both"/>
+      </w:pPr>
+      <w:r>
+        <w:rPr>
+          <w:rFonts w:ascii="Times New Roman" w:hAnsi="Times New Roman"/>
+          <w:rFonts w:ascii="Times New Roman" w:hAnsi="Times New Roman"/>
+          <w:b w:val="0"/>
+          <w:i/>
+          <w:sz w:val="20"/>
+        </w:rPr>
+        <w:t>All TSR values with 95% Wilson score confidence intervals. Values from Monte Carlo simulation ($N=1{,}000$ samples, seed=42), AWGN values directly simulated, fading channel values from extended simulation sweep.</w:t>
       </w:r>
     </w:p>
     <w:p>
@@ -14236,6 +16002,252 @@
           <w:i w:val="0"/>
           <w:sz w:val="20"/>
         </w:rPr>
+        <w:t xml:space="preserve">Key findings: (1) </w:t>
+      </w:r>
+      <w:r>
+        <w:rPr>
+          <w:rFonts w:ascii="Times New Roman" w:hAnsi="Times New Roman"/>
+          <w:rFonts w:ascii="Times New Roman" w:hAnsi="Times New Roman"/>
+          <w:b/>
+          <w:i w:val="0"/>
+          <w:sz w:val="20"/>
+        </w:rPr>
+        <w:t>Compression-fading interaction is sub-additive</w:t>
+      </w:r>
+      <w:r>
+        <w:rPr>
+          <w:rFonts w:ascii="Times New Roman" w:hAnsi="Times New Roman"/>
+          <w:rFonts w:ascii="Times New Roman" w:hAnsi="Times New Roman"/>
+          <w:b w:val="0"/>
+          <w:i w:val="0"/>
+          <w:sz w:val="20"/>
+        </w:rPr>
+        <w:t xml:space="preserve">: increasing </w:t>
+      </w:r>
+      <w:r>
+        <w:rPr>
+          <w:rFonts w:ascii="Times New Roman" w:hAnsi="Times New Roman"/>
+          <w:rFonts w:ascii="Times New Roman" w:hAnsi="Times New Roman"/>
+          <w:b w:val="0"/>
+          <w:i w:val="0"/>
+          <w:sz w:val="20"/>
+        </w:rPr>
+        <w:t>k</w:t>
+      </w:r>
+      <w:r>
+        <w:rPr>
+          <w:rFonts w:ascii="Times New Roman" w:hAnsi="Times New Roman"/>
+          <w:rFonts w:ascii="Times New Roman" w:hAnsi="Times New Roman"/>
+          <w:b w:val="0"/>
+          <w:i w:val="0"/>
+          <w:sz w:val="20"/>
+        </w:rPr>
+        <w:t xml:space="preserve"> from 8 to 128 improves TSR by 7.2% under AWGN but by 23.2% under Rayleigh, suggesting that larger bottleneck dimensions partially compensate for fading-induced distortion; (2) </w:t>
+      </w:r>
+      <w:r>
+        <w:rPr>
+          <w:rFonts w:ascii="Times New Roman" w:hAnsi="Times New Roman"/>
+          <w:rFonts w:ascii="Times New Roman" w:hAnsi="Times New Roman"/>
+          <w:b/>
+          <w:i w:val="0"/>
+          <w:sz w:val="20"/>
+        </w:rPr>
+        <w:t>Rayleigh represents a hard performance floor</w:t>
+      </w:r>
+      <w:r>
+        <w:rPr>
+          <w:rFonts w:ascii="Times New Roman" w:hAnsi="Times New Roman"/>
+          <w:rFonts w:ascii="Times New Roman" w:hAnsi="Times New Roman"/>
+          <w:b w:val="0"/>
+          <w:i w:val="0"/>
+          <w:sz w:val="20"/>
+        </w:rPr>
+        <w:t xml:space="preserve"> — even with </w:t>
+      </w:r>
+      <w:r>
+        <w:rPr>
+          <w:rFonts w:ascii="Times New Roman" w:hAnsi="Times New Roman"/>
+          <w:rFonts w:ascii="Times New Roman" w:hAnsi="Times New Roman"/>
+          <w:b w:val="0"/>
+          <w:i w:val="0"/>
+          <w:sz w:val="20"/>
+        </w:rPr>
+        <w:t>k = 128</w:t>
+      </w:r>
+      <w:r>
+        <w:rPr>
+          <w:rFonts w:ascii="Times New Roman" w:hAnsi="Times New Roman"/>
+          <w:rFonts w:ascii="Times New Roman" w:hAnsi="Times New Roman"/>
+          <w:b w:val="0"/>
+          <w:i w:val="0"/>
+          <w:sz w:val="20"/>
+        </w:rPr>
+        <w:t xml:space="preserve"> (25% compression ratio), Rayleigh TSR (0.643) remains below the AWGN TSR at </w:t>
+      </w:r>
+      <w:r>
+        <w:rPr>
+          <w:rFonts w:ascii="Times New Roman" w:hAnsi="Times New Roman"/>
+          <w:rFonts w:ascii="Times New Roman" w:hAnsi="Times New Roman"/>
+          <w:b w:val="0"/>
+          <w:i w:val="0"/>
+          <w:sz w:val="20"/>
+        </w:rPr>
+        <w:t>k = 8</w:t>
+      </w:r>
+      <w:r>
+        <w:rPr>
+          <w:rFonts w:ascii="Times New Roman" w:hAnsi="Times New Roman"/>
+          <w:rFonts w:ascii="Times New Roman" w:hAnsi="Times New Roman"/>
+          <w:b w:val="0"/>
+          <w:i w:val="0"/>
+          <w:sz w:val="20"/>
+        </w:rPr>
+        <w:t xml:space="preserve"> (0.855), demonstrating that fading channel degradation dominates compression effects at 10 dB SNR; (3) </w:t>
+      </w:r>
+      <w:r>
+        <w:rPr>
+          <w:rFonts w:ascii="Times New Roman" w:hAnsi="Times New Roman"/>
+          <w:rFonts w:ascii="Times New Roman" w:hAnsi="Times New Roman"/>
+          <w:b/>
+          <w:i w:val="0"/>
+          <w:sz w:val="20"/>
+        </w:rPr>
+        <w:t>AWGN TSR is non-monotone in $k$</w:t>
+      </w:r>
+      <w:r>
+        <w:rPr>
+          <w:rFonts w:ascii="Times New Roman" w:hAnsi="Times New Roman"/>
+          <w:rFonts w:ascii="Times New Roman" w:hAnsi="Times New Roman"/>
+          <w:b w:val="0"/>
+          <w:i w:val="0"/>
+          <w:sz w:val="20"/>
+        </w:rPr>
+        <w:t xml:space="preserve"> — the dip at </w:t>
+      </w:r>
+      <w:r>
+        <w:rPr>
+          <w:rFonts w:ascii="Times New Roman" w:hAnsi="Times New Roman"/>
+          <w:rFonts w:ascii="Times New Roman" w:hAnsi="Times New Roman"/>
+          <w:b w:val="0"/>
+          <w:i w:val="0"/>
+          <w:sz w:val="20"/>
+        </w:rPr>
+        <w:t>k = 64</w:t>
+      </w:r>
+      <w:r>
+        <w:rPr>
+          <w:rFonts w:ascii="Times New Roman" w:hAnsi="Times New Roman"/>
+          <w:rFonts w:ascii="Times New Roman" w:hAnsi="Times New Roman"/>
+          <w:b w:val="0"/>
+          <w:i w:val="0"/>
+          <w:sz w:val="20"/>
+        </w:rPr>
+        <w:t xml:space="preserve"> (TSR = 0.862) vs. </w:t>
+      </w:r>
+      <w:r>
+        <w:rPr>
+          <w:rFonts w:ascii="Times New Roman" w:hAnsi="Times New Roman"/>
+          <w:rFonts w:ascii="Times New Roman" w:hAnsi="Times New Roman"/>
+          <w:b w:val="0"/>
+          <w:i w:val="0"/>
+          <w:sz w:val="20"/>
+        </w:rPr>
+        <w:t>k = 32</w:t>
+      </w:r>
+      <w:r>
+        <w:rPr>
+          <w:rFonts w:ascii="Times New Roman" w:hAnsi="Times New Roman"/>
+          <w:rFonts w:ascii="Times New Roman" w:hAnsi="Times New Roman"/>
+          <w:b w:val="0"/>
+          <w:i w:val="0"/>
+          <w:sz w:val="20"/>
+        </w:rPr>
+        <w:t xml:space="preserve"> (0.878) reflects training variance, not a genuine compression-fidelity reversal; (4) The Rician </w:t>
+      </w:r>
+      <w:r>
+        <w:rPr>
+          <w:rFonts w:ascii="Times New Roman" w:hAnsi="Times New Roman"/>
+          <w:rFonts w:ascii="Times New Roman" w:hAnsi="Times New Roman"/>
+          <w:b w:val="0"/>
+          <w:i w:val="0"/>
+          <w:sz w:val="20"/>
+        </w:rPr>
+        <w:t>K = 10</w:t>
+      </w:r>
+      <w:r>
+        <w:rPr>
+          <w:rFonts w:ascii="Times New Roman" w:hAnsi="Times New Roman"/>
+          <w:rFonts w:ascii="Times New Roman" w:hAnsi="Times New Roman"/>
+          <w:b w:val="0"/>
+          <w:i w:val="0"/>
+          <w:sz w:val="20"/>
+        </w:rPr>
+        <w:t xml:space="preserve"> and TDL-A channels track AWGN within 7–8% across all </w:t>
+      </w:r>
+      <w:r>
+        <w:rPr>
+          <w:rFonts w:ascii="Times New Roman" w:hAnsi="Times New Roman"/>
+          <w:rFonts w:ascii="Times New Roman" w:hAnsi="Times New Roman"/>
+          <w:b w:val="0"/>
+          <w:i w:val="0"/>
+          <w:sz w:val="20"/>
+        </w:rPr>
+        <w:t>k</w:t>
+      </w:r>
+      <w:r>
+        <w:rPr>
+          <w:rFonts w:ascii="Times New Roman" w:hAnsi="Times New Roman"/>
+          <w:rFonts w:ascii="Times New Roman" w:hAnsi="Times New Roman"/>
+          <w:b w:val="0"/>
+          <w:i w:val="0"/>
+          <w:sz w:val="20"/>
+        </w:rPr>
+        <w:t>, confirming their suitability for high-reliability semantic deployments.</w:t>
+      </w:r>
+    </w:p>
+    <w:p>
+      <w:pPr>
+        <w:ind w:left="360"/>
+        <w:jc w:val="both"/>
+      </w:pPr>
+      <w:r>
+        <w:rPr>
+          <w:rFonts w:ascii="Times New Roman" w:hAnsi="Times New Roman"/>
+          <w:rFonts w:ascii="Times New Roman" w:hAnsi="Times New Roman"/>
+          <w:b w:val="0"/>
+          <w:i/>
+          <w:sz w:val="18"/>
+        </w:rPr>
+        <w:t>Fig. 9. Task Success Rate (TSR) vs. Bottleneck Dimension $k$ for Five Channel Models at SNR = 10 dB. This line plot displays bottleneck dimension $k \in \{8, 16, 32, 64, 128\}$ on the X-axis (logarithmic scale) and TSR [0, 1] on the Y-axis. Five curves are shown: (1) AWGN (solid blue, circle markers): flat near 0.87 with slight dip at $k=64$; (2) Rayleigh (solid red, square markers): rising from 0.522 to 0.643, always lowest; (3) Rician $K=5$ (dashed green, triangle markers): rising from 0.641 to 0.792; (4) Rician $K=10$ (dashed purple, diamond markers): rising from 0.748 to 0.878; (5) TDL-A 3GPP (dash-dot orange, cross markers): rising from 0.736 to 0.869. Error bars show 95% Wilson score CIs at each $k$. A shaded region between AWGN and Rayleigh curves is labeled "Fading degradation region." A secondary X-axis (top) shows compression ratio $\rho$ (1.56%, 3.12%, 6.25%, 12.5%, 25%). Monte Carlo simulation, $N=1{,}000$, seed=42.</w:t>
+      </w:r>
+    </w:p>
+    <w:p>
+      <w:pPr>
+        <w:spacing w:before="80" w:after="40"/>
+      </w:pPr>
+      <w:r>
+        <w:rPr>
+          <w:rFonts w:ascii="Times New Roman" w:hAnsi="Times New Roman"/>
+          <w:rFonts w:ascii="Times New Roman" w:hAnsi="Times New Roman"/>
+          <w:b/>
+          <w:i w:val="0"/>
+          <w:sz w:val="20"/>
+        </w:rPr>
+        <w:t>C. Task Success Rate vs. SNR</w:t>
+      </w:r>
+    </w:p>
+    <w:p>
+      <w:pPr>
+        <w:jc w:val="both"/>
+      </w:pPr>
+      <w:r>
+        <w:rPr>
+          <w:rFonts w:ascii="Times New Roman" w:hAnsi="Times New Roman"/>
+          <w:rFonts w:ascii="Times New Roman" w:hAnsi="Times New Roman"/>
+          <w:b w:val="0"/>
+          <w:i w:val="0"/>
+          <w:sz w:val="20"/>
+        </w:rPr>
         <w:t xml:space="preserve">Simulation results demonstrate that the proposed semantic autoencoder with </w:t>
       </w:r>
       <w:r>
@@ -14276,7 +16288,7 @@
           <w:i w:val="0"/>
           <w:sz w:val="20"/>
         </w:rPr>
-        <w:t xml:space="preserve"> at SNR = 10 dB over AWGN (95% Wilson CI: [0.856, 0.897]), confirming the target TSR ≈ 0.87 stated in Table IV. The compression ratio </w:t>
+        <w:t xml:space="preserve"> at SNR = 10 dB over AWGN (95% Wilson CI: [0.856, 0.897]) (as shown in Table IV, Section XI.E), confirming the target TSR ≈ 0.87 stated in Table IV. The compression ratio </w:t>
       </w:r>
       <w:r>
         <w:rPr>
@@ -16333,7 +18345,7 @@
           <w:i/>
           <w:sz w:val="20"/>
         </w:rPr>
-        <w:t>RSE values use the corrected Kozachenko–Leonenko entropy estimator; values are smaller than the previous jitter-based proxy (see Section XI.B note) and should be interpreted comparatively. TSR values for all rows and ARR/SASR for AWGN and Rayleigh (SNR 5, 10, 15 dB) are directly simulated via PGD; remaining resilience metrics use analytical scaling estimates (see Appendix B for methodology).</w:t>
+        <w:t>RSE values use the corrected Kozachenko–Leonenko entropy estimator; values are smaller than the previous jitter-based proxy (see Section XI.B note (RSE magnitude explanation)) and should be interpreted comparatively. TSR values for all rows and ARR/SASR for AWGN and Rayleigh (SNR 5, 10, 15 dB) are directly simulated via PGD; remaining resilience metrics use analytical scaling estimates (see Appendix B for methodology).</w:t>
       </w:r>
     </w:p>
     <w:p>
@@ -17570,7 +19582,7 @@
           <w:i w:val="0"/>
           <w:sz w:val="20"/>
         </w:rPr>
-        <w:t>E. Multi-User Semantic Communications and RSMA</w:t>
+        <w:t>D. Adversarial Robustness Evolution</w:t>
       </w:r>
     </w:p>
     <w:p>
@@ -17585,106 +19597,308 @@
           <w:i w:val="0"/>
           <w:sz w:val="20"/>
         </w:rPr>
-        <w:t>Semantic metric evaluation in multi-user scenarios introduces additional complexity not addressed in the current single-link framework. Rate-Splitting Multiple Access (RSMA) [77], which partitions transmitted messages into common and private parts decoded at different receivers, has recently been demonstrated to significantly improve semantic metrics in heterogeneous multi-user environments. RSMA's partial interference management enables each receiver to decode the semantic content most relevant to its specific task, directly impacting Intent Alignment (ICC, SCI) and Task Completion metrics across the user population. Future extensions of the proposed framework should incorporate RSMA-specific metric adaptations, particularly for the SCI and ICC metrics in multicast scenarios with heterogeneous user intent profiles.</w:t>
+        <w:t>Static robustness metrics (ARR, SASR) cannot fully capture the evolving threat landscape, as sophisticated adversaries adapt their attacks based on knowledge of the deployed defense mechanisms [53]. Key research directions include certified defenses via Lipschitz-constrained neural architectures that provide provable ARR guarantees under adaptive attacks; adaptive red-team testing protocols using interval bound propagation [54] to continuously challenge deployed semantic systems; and robustness-by-design architectures that exploit semantic invariance—the observation that semantic content is often invariant to perturbations that are destructive at the bit level. The theoretical foundations for certifiable robustness in semantic systems draw on both formal verification [32], [33] and information-theoretic channel coding [62].</w:t>
       </w:r>
     </w:p>
     <w:p>
       <w:pPr>
-        <w:jc w:val="both"/>
-      </w:pPr>
-      <w:r>
-        <w:rPr>
-          <w:rFonts w:ascii="Times New Roman" w:hAnsi="Times New Roman"/>
-          <w:rFonts w:ascii="Times New Roman" w:hAnsi="Times New Roman"/>
-          <w:b w:val="0"/>
-          <w:i w:val="0"/>
-          <w:sz w:val="20"/>
-        </w:rPr>
-        <w:t>Static robustness metrics (ARR, SASR) cannot fully capture the evolving threat landscape, as sophisticated adversaries adapt their attacks based on knowledge of the deployed defense mechanisms [53]. Key research directions include certified defenses via Lipschitz-constrained neural architectures that provide provable ARR guarantees under adaptive attacks; adaptive red-team testing protocols using interval bound propagation [54] to continuously challenge deployed semantic systems; and robustness-by-design architectures that exploit semantic invariance—the observation that semantic content is often invariant to perturbations that are destructive at the bit level. The theoretical foundations for certifiable robustness in semantic systems draw on both formal verification [32], [33] and information-theoretic channel coding [62].</w:t>
+        <w:spacing w:before="80" w:after="40"/>
+      </w:pPr>
+      <w:r>
+        <w:rPr>
+          <w:rFonts w:ascii="Times New Roman" w:hAnsi="Times New Roman"/>
+          <w:rFonts w:ascii="Times New Roman" w:hAnsi="Times New Roman"/>
+          <w:b/>
+          <w:i w:val="0"/>
+          <w:sz w:val="20"/>
+        </w:rPr>
+        <w:t>E. Multi-User Semantic Communications and RSMA</w:t>
       </w:r>
     </w:p>
     <w:p>
       <w:pPr>
-        <w:spacing w:before="80" w:after="40"/>
-      </w:pPr>
-      <w:r>
-        <w:rPr>
-          <w:rFonts w:ascii="Times New Roman" w:hAnsi="Times New Roman"/>
-          <w:rFonts w:ascii="Times New Roman" w:hAnsi="Times New Roman"/>
-          <w:b/>
-          <w:i w:val="0"/>
-          <w:sz w:val="20"/>
-        </w:rPr>
-        <w:t>E. Emerging Technologies</w:t>
+        <w:jc w:val="both"/>
+      </w:pPr>
+      <w:r>
+        <w:rPr>
+          <w:rFonts w:ascii="Times New Roman" w:hAnsi="Times New Roman"/>
+          <w:rFonts w:ascii="Times New Roman" w:hAnsi="Times New Roman"/>
+          <w:b w:val="0"/>
+          <w:i w:val="0"/>
+          <w:sz w:val="20"/>
+        </w:rPr>
+        <w:t>Semantic metric evaluation in multi-user scenarios introduces additional complexity not addressed in the current single-link framework. Rate-Splitting Multiple Access (RSMA) [77], which partitions transmitted messages into common and private parts decoded at different receivers, has recently been demonstrated to significantly improve semantic metrics in heterogeneous multi-user environments. RSMA's partial interference management enables each receiver to decode the semantic content most relevant to its specific task, directly impacting Intent Alignment (ICC, SCI) and Task Completion metrics across the user population. Future extensions of the proposed framework should incorporate RSMA-specific metric adaptations, particularly for the SCI and ICC metrics in multicast scenarios with heterogeneous user intent profiles.</w:t>
       </w:r>
     </w:p>
     <w:p>
       <w:pPr>
-        <w:jc w:val="both"/>
-      </w:pPr>
-      <w:r>
-        <w:rPr>
-          <w:rFonts w:ascii="Times New Roman" w:hAnsi="Times New Roman"/>
-          <w:rFonts w:ascii="Times New Roman" w:hAnsi="Times New Roman"/>
-          <w:b w:val="0"/>
-          <w:i w:val="0"/>
-          <w:sz w:val="20"/>
-        </w:rPr>
-        <w:t xml:space="preserve">Generative AI enables </w:t>
-      </w:r>
-      <w:r>
-        <w:rPr>
-          <w:rFonts w:ascii="Times New Roman" w:hAnsi="Times New Roman"/>
-          <w:rFonts w:ascii="Times New Roman" w:hAnsi="Times New Roman"/>
-          <w:b w:val="0"/>
-          <w:i/>
-          <w:sz w:val="20"/>
-        </w:rPr>
-        <w:t>generative semantic transmission</w:t>
-      </w:r>
-      <w:r>
-        <w:rPr>
-          <w:rFonts w:ascii="Times New Roman" w:hAnsi="Times New Roman"/>
-          <w:rFonts w:ascii="Times New Roman" w:hAnsi="Times New Roman"/>
-          <w:b w:val="0"/>
-          <w:i w:val="0"/>
-          <w:sz w:val="20"/>
-        </w:rPr>
-        <w:t>, where only a compact latent code is transmitted and the receiver synthesizes the full semantic content locally [55], achieving compression ratios of 100–1000× compared to bit-exact approaches and demanding new perceptual fidelity metrics that go beyond pixel-level or embedding-level comparison. Integration with semantic digital twins [56] requires consistency metrics guaranteeing synchronization safety bounds for critical applications such as autonomous vehicle teleoperation and surgical robotics. Quantum algorithms for optimal transport may dramatically accelerate Wasserstein distance computation [57], enabling real-time SWD evaluation for high-dimensional embeddings. Neuromorphic computing architectures [58] offer 100–1000× improvements in energy efficiency for battery-constrained edge semantic encoding and decoding, potentially enabling on-device metric computation that is currently feasible only at Level 2 or Level 3 of the distributed architecture.</w:t>
+        <w:spacing w:before="80" w:after="40"/>
+      </w:pPr>
+      <w:r>
+        <w:rPr>
+          <w:rFonts w:ascii="Times New Roman" w:hAnsi="Times New Roman"/>
+          <w:rFonts w:ascii="Times New Roman" w:hAnsi="Times New Roman"/>
+          <w:b/>
+          <w:i w:val="0"/>
+          <w:sz w:val="20"/>
+        </w:rPr>
+        <w:t>F. Emerging Technologies</w:t>
       </w:r>
     </w:p>
     <w:p>
       <w:pPr>
-        <w:spacing w:before="80" w:after="40"/>
-      </w:pPr>
-      <w:r>
-        <w:rPr>
-          <w:rFonts w:ascii="Times New Roman" w:hAnsi="Times New Roman"/>
-          <w:rFonts w:ascii="Times New Roman" w:hAnsi="Times New Roman"/>
-          <w:b/>
-          <w:i w:val="0"/>
-          <w:sz w:val="20"/>
-        </w:rPr>
-        <w:t>F. Large Language Models in Semantic Communications</w:t>
+        <w:jc w:val="both"/>
+      </w:pPr>
+      <w:r>
+        <w:rPr>
+          <w:rFonts w:ascii="Times New Roman" w:hAnsi="Times New Roman"/>
+          <w:rFonts w:ascii="Times New Roman" w:hAnsi="Times New Roman"/>
+          <w:b w:val="0"/>
+          <w:i w:val="0"/>
+          <w:sz w:val="20"/>
+        </w:rPr>
+        <w:t xml:space="preserve">Generative AI enables </w:t>
+      </w:r>
+      <w:r>
+        <w:rPr>
+          <w:rFonts w:ascii="Times New Roman" w:hAnsi="Times New Roman"/>
+          <w:rFonts w:ascii="Times New Roman" w:hAnsi="Times New Roman"/>
+          <w:b w:val="0"/>
+          <w:i/>
+          <w:sz w:val="20"/>
+        </w:rPr>
+        <w:t>generative semantic transmission</w:t>
+      </w:r>
+      <w:r>
+        <w:rPr>
+          <w:rFonts w:ascii="Times New Roman" w:hAnsi="Times New Roman"/>
+          <w:rFonts w:ascii="Times New Roman" w:hAnsi="Times New Roman"/>
+          <w:b w:val="0"/>
+          <w:i w:val="0"/>
+          <w:sz w:val="20"/>
+        </w:rPr>
+        <w:t>, where only a compact latent code is transmitted and the receiver synthesizes the full semantic content locally [55], achieving compression ratios of 100–1000× compared to bit-exact approaches and demanding new perceptual fidelity metrics that go beyond pixel-level or embedding-level comparison. Integration with semantic digital twins [56] requires consistency metrics guaranteeing synchronization safety bounds for critical applications such as autonomous vehicle teleoperation and surgical robotics. Quantum algorithms for optimal transport may dramatically accelerate Wasserstein distance computation [57], enabling real-time SWD evaluation for high-dimensional embeddings. Neuromorphic computing architectures [58] offer 100–1000× improvements in energy efficiency for battery-constrained edge semantic encoding and decoding, potentially enabling on-device metric computation that is currently feasible only at Level 2 or Level 3 of the distributed architecture.</w:t>
       </w:r>
     </w:p>
     <w:p>
       <w:pPr>
-        <w:jc w:val="both"/>
-      </w:pPr>
-      <w:r>
-        <w:rPr>
-          <w:rFonts w:ascii="Times New Roman" w:hAnsi="Times New Roman"/>
-          <w:rFonts w:ascii="Times New Roman" w:hAnsi="Times New Roman"/>
-          <w:b w:val="0"/>
-          <w:i w:val="0"/>
-          <w:sz w:val="20"/>
-        </w:rPr>
-        <w:t>The rapid advancement of Large Language Models (LLMs) introduces both opportunities and challenges for semantic communication metrics. LLM-empowered semantic communication systems [74] leverage foundation models for context-aware encoding and generative decoding, achieving unprecedented compression ratios for text and multimodal content. However, existing metrics in the proposed framework require extension to address LLM-specific phenomena: hallucination detection (where generated content is semantically plausible but factually incorrect), reasoning chain fidelity (preserving multi-step logical arguments), and cross-lingual semantic consistency. The proposed RSE and NSMI metrics can be adapted using LLM embedding spaces, while new metrics for generative fidelity—distinguishing between faithful semantic reconstruction and creative hallucination—represent an important research direction for the framework's evolution. Integration with multimodal LLMs further necessitates cross-modal semantic consistency metrics for Internet of Senses applications where text, image, audio, and haptic channels must maintain coherent semantic representations.</w:t>
+        <w:spacing w:before="80" w:after="40"/>
+      </w:pPr>
+      <w:r>
+        <w:rPr>
+          <w:rFonts w:ascii="Times New Roman" w:hAnsi="Times New Roman"/>
+          <w:rFonts w:ascii="Times New Roman" w:hAnsi="Times New Roman"/>
+          <w:b/>
+          <w:i w:val="0"/>
+          <w:sz w:val="20"/>
+        </w:rPr>
+        <w:t>G. Large Language Models in Semantic Communications</w:t>
       </w:r>
     </w:p>
     <w:p>
       <w:pPr>
+        <w:jc w:val="both"/>
+      </w:pPr>
+      <w:r>
+        <w:rPr>
+          <w:rFonts w:ascii="Times New Roman" w:hAnsi="Times New Roman"/>
+          <w:rFonts w:ascii="Times New Roman" w:hAnsi="Times New Roman"/>
+          <w:b w:val="0"/>
+          <w:i w:val="0"/>
+          <w:sz w:val="20"/>
+        </w:rPr>
+        <w:t>The rapid advancement of Large Language Models (LLMs) introduces both opportunities and challenges for semantic communication metrics. LLM-empowered semantic communication systems [74] leverage foundation models for context-aware encoding and generative decoding, achieving unprecedented compression ratios for text and multimodal content. However, existing metrics in the proposed framework require extension to address LLM-specific phenomena: hallucination detection (where generated content is semantically plausible but factually incorrect), reasoning chain fidelity (preserving multi-step logical arguments), and cross-lingual semantic consistency. The proposed RSE and NSMI metrics can be adapted using LLM embedding spaces, while new metrics for generative fidelity—distinguishing between faithful semantic reconstruction and creative hallucination—represent an important research direction for the framework's evolution. Integration with multimodal LLMs further necessitates cross-modal semantic consistency metrics for Internet of Senses applications where text, image, audio, and haptic channels must maintain coherent semantic representations.</w:t>
+      </w:r>
+    </w:p>
+    <w:p>
+      <w:pPr>
+        <w:jc w:val="both"/>
+      </w:pPr>
+      <w:r>
+        <w:rPr>
+          <w:rFonts w:ascii="Times New Roman" w:hAnsi="Times New Roman"/>
+          <w:rFonts w:ascii="Times New Roman" w:hAnsi="Times New Roman"/>
+          <w:b/>
+          <w:i w:val="0"/>
+          <w:sz w:val="20"/>
+        </w:rPr>
+        <w:t>Cross-Modal Semantic Consistency:</w:t>
+      </w:r>
+      <w:r>
+        <w:rPr>
+          <w:rFonts w:ascii="Times New Roman" w:hAnsi="Times New Roman"/>
+          <w:rFonts w:ascii="Times New Roman" w:hAnsi="Times New Roman"/>
+          <w:b w:val="0"/>
+          <w:i w:val="0"/>
+          <w:sz w:val="20"/>
+        </w:rPr>
+        <w:t xml:space="preserve"> For a multimodal transmission system conveying information </w:t>
+      </w:r>
+      <w:r>
+        <w:rPr>
+          <w:rFonts w:ascii="Times New Roman" w:hAnsi="Times New Roman"/>
+          <w:rFonts w:ascii="Times New Roman" w:hAnsi="Times New Roman"/>
+          <w:b w:val="0"/>
+          <w:i w:val="0"/>
+          <w:sz w:val="20"/>
+        </w:rPr>
+        <w:t>\mathbf{I} = (I_{\text{text}}, I_{\text{image}}, I_{\text{audio}})</w:t>
+      </w:r>
+      <w:r>
+        <w:rPr>
+          <w:rFonts w:ascii="Times New Roman" w:hAnsi="Times New Roman"/>
+          <w:rFonts w:ascii="Times New Roman" w:hAnsi="Times New Roman"/>
+          <w:b w:val="0"/>
+          <w:i w:val="0"/>
+          <w:sz w:val="20"/>
+        </w:rPr>
+        <w:t>, the cross-modal semantic coherence is:</w:t>
+      </w:r>
+    </w:p>
+    <w:p>
+      <w:pPr>
+        <w:spacing w:before="80" w:after="80"/>
+        <w:jc w:val="center"/>
+      </w:pPr>
+      <w:r>
+        <w:rPr>
+          <w:rFonts w:ascii="Times New Roman" w:hAnsi="Times New Roman"/>
+          <w:rFonts w:ascii="Times New Roman" w:hAnsi="Times New Roman"/>
+          <w:b w:val="0"/>
+          <w:i/>
+          <w:sz w:val="20"/>
+        </w:rPr>
+        <w:t>CMSC(\hat{I}_{\text{text}}, \hat{I}_{\text{image}}) = \cos\!\left(\phi_{\text{text}}(\hat{I}_{\text{text}}),\, \phi_{\text{image}}(\hat{I}_{\text{image}})\right)</w:t>
+      </w:r>
+    </w:p>
+    <w:p>
+      <w:pPr>
+        <w:jc w:val="both"/>
+      </w:pPr>
+      <w:r>
+        <w:rPr>
+          <w:rFonts w:ascii="Times New Roman" w:hAnsi="Times New Roman"/>
+          <w:rFonts w:ascii="Times New Roman" w:hAnsi="Times New Roman"/>
+          <w:b w:val="0"/>
+          <w:i w:val="0"/>
+          <w:sz w:val="20"/>
+        </w:rPr>
+        <w:t xml:space="preserve">where </w:t>
+      </w:r>
+      <w:r>
+        <w:rPr>
+          <w:rFonts w:ascii="Times New Roman" w:hAnsi="Times New Roman"/>
+          <w:rFonts w:ascii="Times New Roman" w:hAnsi="Times New Roman"/>
+          <w:b w:val="0"/>
+          <w:i w:val="0"/>
+          <w:sz w:val="20"/>
+        </w:rPr>
+        <w:t>\phi_{\text{text}}, \phi_{\text{image}}</w:t>
+      </w:r>
+      <w:r>
+        <w:rPr>
+          <w:rFonts w:ascii="Times New Roman" w:hAnsi="Times New Roman"/>
+          <w:rFonts w:ascii="Times New Roman" w:hAnsi="Times New Roman"/>
+          <w:b w:val="0"/>
+          <w:i w:val="0"/>
+          <w:sz w:val="20"/>
+        </w:rPr>
+        <w:t xml:space="preserve"> are modality-specific projection heads that map each modality into a shared semantic embedding space (e.g., via CLIP [72] for text-image alignment). </w:t>
+      </w:r>
+      <w:r>
+        <w:rPr>
+          <w:rFonts w:ascii="Times New Roman" w:hAnsi="Times New Roman"/>
+          <w:rFonts w:ascii="Times New Roman" w:hAnsi="Times New Roman"/>
+          <w:b w:val="0"/>
+          <w:i w:val="0"/>
+          <w:sz w:val="20"/>
+        </w:rPr>
+        <w:t>CMSC \in [-1, 1]</w:t>
+      </w:r>
+      <w:r>
+        <w:rPr>
+          <w:rFonts w:ascii="Times New Roman" w:hAnsi="Times New Roman"/>
+          <w:rFonts w:ascii="Times New Roman" w:hAnsi="Times New Roman"/>
+          <w:b w:val="0"/>
+          <w:i w:val="0"/>
+          <w:sz w:val="20"/>
+        </w:rPr>
+        <w:t xml:space="preserve">, with </w:t>
+      </w:r>
+      <w:r>
+        <w:rPr>
+          <w:rFonts w:ascii="Times New Roman" w:hAnsi="Times New Roman"/>
+          <w:rFonts w:ascii="Times New Roman" w:hAnsi="Times New Roman"/>
+          <w:b w:val="0"/>
+          <w:i w:val="0"/>
+          <w:sz w:val="20"/>
+        </w:rPr>
+        <w:t>CMSC = 1</w:t>
+      </w:r>
+      <w:r>
+        <w:rPr>
+          <w:rFonts w:ascii="Times New Roman" w:hAnsi="Times New Roman"/>
+          <w:rFonts w:ascii="Times New Roman" w:hAnsi="Times New Roman"/>
+          <w:b w:val="0"/>
+          <w:i w:val="0"/>
+          <w:sz w:val="20"/>
+        </w:rPr>
+        <w:t xml:space="preserve"> indicating perfect cross-modal semantic alignment. The multimodal RSE generalizes to:</w:t>
+      </w:r>
+    </w:p>
+    <w:p>
+      <w:pPr>
+        <w:spacing w:before="80" w:after="80"/>
+        <w:jc w:val="center"/>
+      </w:pPr>
+      <w:r>
+        <w:rPr>
+          <w:rFonts w:ascii="Times New Roman" w:hAnsi="Times New Roman"/>
+          <w:rFonts w:ascii="Times New Roman" w:hAnsi="Times New Roman"/>
+          <w:b w:val="0"/>
+          <w:i/>
+          <w:sz w:val="20"/>
+        </w:rPr>
+        <w:t>RSE_{\text{mm}} = \frac{I_s(\mathbf{X}_{\text{mm}}; \hat{\mathbf{X}}_{\text{mm}}; \mathcal{T})}{H_s(\mathbf{X}_{\text{mm}}; \mathcal{T})}</w:t>
+      </w:r>
+    </w:p>
+    <w:p>
+      <w:pPr>
+        <w:jc w:val="both"/>
+      </w:pPr>
+      <w:r>
+        <w:rPr>
+          <w:rFonts w:ascii="Times New Roman" w:hAnsi="Times New Roman"/>
+          <w:rFonts w:ascii="Times New Roman" w:hAnsi="Times New Roman"/>
+          <w:b w:val="0"/>
+          <w:i w:val="0"/>
+          <w:sz w:val="20"/>
+        </w:rPr>
+        <w:t xml:space="preserve">where </w:t>
+      </w:r>
+      <w:r>
+        <w:rPr>
+          <w:rFonts w:ascii="Times New Roman" w:hAnsi="Times New Roman"/>
+          <w:rFonts w:ascii="Times New Roman" w:hAnsi="Times New Roman"/>
+          <w:b w:val="0"/>
+          <w:i w:val="0"/>
+          <w:sz w:val="20"/>
+        </w:rPr>
+        <w:t>\mathbf{X}_{\text{mm}} = \text{concat}(\phi_{\text{text}}(I_{\text{text}}), \phi_{\text{image}}(I_{\text{image}}), \phi_{\text{audio}}(I_{\text{audio}}))</w:t>
+      </w:r>
+      <w:r>
+        <w:rPr>
+          <w:rFonts w:ascii="Times New Roman" w:hAnsi="Times New Roman"/>
+          <w:rFonts w:ascii="Times New Roman" w:hAnsi="Times New Roman"/>
+          <w:b w:val="0"/>
+          <w:i w:val="0"/>
+          <w:sz w:val="20"/>
+        </w:rPr>
+        <w:t xml:space="preserve"> is the joint multimodal embedding. Extending the proposed framework to multimodal systems requires: (1) cross-modal intent alignment metrics that evaluate whether the decoded intents across modalities are mutually consistent; (2) modality-specific TSR evaluation where task success requires correct interpretation across all modalities simultaneously; and (3) cross-modal adversarial robustness, where the adversary can perturb any single modality to corrupt the joint semantic interpretation. These extensions represent a natural next step for the TS 39.xxx framework, particularly for 6G Internet of Senses use cases [4].</w:t>
+      </w:r>
+    </w:p>
+    <w:p>
+      <w:pPr>
         <w:spacing w:before="120" w:after="60"/>
         <w:jc w:val="center"/>
       </w:pPr>
@@ -17846,7 +20060,7 @@
           <w:i w:val="0"/>
           <w:sz w:val="20"/>
         </w:rPr>
-        <w:t xml:space="preserve">, exceeding the conservatively stated 60–80%) while maintaining TSR = 0.867 (95% CI: [0.845, 0.887]) at SNR ≥ 10 dB over AWGN. The spectral efficiency gain is derived from the dimensionality reduction ratio: </w:t>
+        <w:t xml:space="preserve">, exceeding the conservatively stated 60–80%) while maintaining TSR = 0.878 (95% CI: [0.856, 0.897]) at SNR ≥ 10 dB over AWGN. The spectral efficiency gain is derived from the dimensionality reduction ratio: </w:t>
       </w:r>
       <w:r>
         <w:rPr>

</xml_diff>

<commit_message>
Final corrections: Table I-D actual table, CI for all metrics, duplicate removal, docx regenerated
Agent-Logs-Url: https://github.com/eastaizah/Papers/sessions/15e36af1-601c-4fb1-ae6b-fb57c84b1d66

Co-authored-by: eastaizah <258072108+eastaizah@users.noreply.github.com>
</commit_message>
<xml_diff>
--- a/P9/Framework_Semanticas_Summary_IEEE_Final.docx
+++ b/P9/Framework_Semanticas_Summary_IEEE_Final.docx
@@ -13769,47 +13769,7 @@
           <w:i w:val="0"/>
           <w:sz w:val="20"/>
         </w:rPr>
-        <w:t xml:space="preserve">The semantic embedding space is instantiated using CLIP (ViT-B/32, OpenAI, 2021) [72] for visual-linguistic tasks and Sentence-BERT (all-MiniLM-L6-v2, version 2.2.2) [73] for natural language semantics, both producing </w:t>
-      </w:r>
-      <w:r>
-        <w:rPr>
-          <w:rFonts w:ascii="Times New Roman" w:hAnsi="Times New Roman"/>
-          <w:rFonts w:ascii="Times New Roman" w:hAnsi="Times New Roman"/>
-          <w:b w:val="0"/>
-          <w:i w:val="0"/>
-          <w:sz w:val="20"/>
-        </w:rPr>
-        <w:t>d = 512</w:t>
-      </w:r>
-      <w:r>
-        <w:rPr>
-          <w:rFonts w:ascii="Times New Roman" w:hAnsi="Times New Roman"/>
-          <w:rFonts w:ascii="Times New Roman" w:hAnsi="Times New Roman"/>
-          <w:b w:val="0"/>
-          <w:i w:val="0"/>
-          <w:sz w:val="20"/>
-        </w:rPr>
-        <w:t xml:space="preserve">-dimensional embeddings. CLIP uses ViT-B/32 weights with 151M parameters, patch size 32×32, and default temperature </w:t>
-      </w:r>
-      <w:r>
-        <w:rPr>
-          <w:rFonts w:ascii="Times New Roman" w:hAnsi="Times New Roman"/>
-          <w:rFonts w:ascii="Times New Roman" w:hAnsi="Times New Roman"/>
-          <w:b w:val="0"/>
-          <w:i w:val="0"/>
-          <w:sz w:val="20"/>
-        </w:rPr>
-        <w:t>\tau = 0.07</w:t>
-      </w:r>
-      <w:r>
-        <w:rPr>
-          <w:rFonts w:ascii="Times New Roman" w:hAnsi="Times New Roman"/>
-          <w:rFonts w:ascii="Times New Roman" w:hAnsi="Times New Roman"/>
-          <w:b w:val="0"/>
-          <w:i w:val="0"/>
-          <w:sz w:val="20"/>
-        </w:rPr>
-        <w:t>. Sentence-BERT uses 6-layer MiniLM with mean pooling, 22.7M parameters, and maximum sequence length 256 tokens. For the simulation, class-conditional Gaussian embeddings (</w:t>
+        <w:t>For the simulation, class-conditional Gaussian embeddings (</w:t>
       </w:r>
       <w:r>
         <w:rPr>
@@ -13849,7 +13809,27 @@
           <w:i w:val="0"/>
           <w:sz w:val="20"/>
         </w:rPr>
-        <w:t xml:space="preserve">, 10 classes) serve as a tractable proxy that preserves the geometric structure of real foundation model embeddings while enabling reproducible evaluation. To validate that the synthetic results generalize to realistic embeddings, a supplementary evaluation was conducted using CLIP ViT-B/32 embeddings extracted from </w:t>
+        <w:t xml:space="preserve">, 10 classes, </w:t>
+      </w:r>
+      <w:r>
+        <w:rPr>
+          <w:rFonts w:ascii="Times New Roman" w:hAnsi="Times New Roman"/>
+          <w:rFonts w:ascii="Times New Roman" w:hAnsi="Times New Roman"/>
+          <w:b w:val="0"/>
+          <w:i w:val="0"/>
+          <w:sz w:val="20"/>
+        </w:rPr>
+        <w:t>d=512</w:t>
+      </w:r>
+      <w:r>
+        <w:rPr>
+          <w:rFonts w:ascii="Times New Roman" w:hAnsi="Times New Roman"/>
+          <w:rFonts w:ascii="Times New Roman" w:hAnsi="Times New Roman"/>
+          <w:b w:val="0"/>
+          <w:i w:val="0"/>
+          <w:sz w:val="20"/>
+        </w:rPr>
+        <w:t xml:space="preserve">) serve as a tractable proxy for the CLIP and Sentence-BERT embeddings described in Section X.B, preserving their geometric structure while enabling fully reproducible evaluation. To validate generalization to realistic embeddings, a supplementary evaluation was conducted using CLIP ViT-B/32 embeddings extracted from </w:t>
       </w:r>
       <w:r>
         <w:rPr>
@@ -13869,27 +13849,7 @@
           <w:i w:val="0"/>
           <w:sz w:val="20"/>
         </w:rPr>
-        <w:t xml:space="preserve"> CIFAR-10 images (100 per class). The CLIP embeddings (</w:t>
-      </w:r>
-      <w:r>
-        <w:rPr>
-          <w:rFonts w:ascii="Times New Roman" w:hAnsi="Times New Roman"/>
-          <w:rFonts w:ascii="Times New Roman" w:hAnsi="Times New Roman"/>
-          <w:b w:val="0"/>
-          <w:i w:val="0"/>
-          <w:sz w:val="20"/>
-        </w:rPr>
-        <w:t>d = 512</w:t>
-      </w:r>
-      <w:r>
-        <w:rPr>
-          <w:rFonts w:ascii="Times New Roman" w:hAnsi="Times New Roman"/>
-          <w:rFonts w:ascii="Times New Roman" w:hAnsi="Times New Roman"/>
-          <w:b w:val="0"/>
-          <w:i w:val="0"/>
-          <w:sz w:val="20"/>
-        </w:rPr>
-        <w:t>) exhibit a non-isotropic covariance structure distinct from the synthetic Gaussians, with mean inter-class distance 14.3 ± 2.1 and intra-class variance 0.82 ± 0.09 (vs. 2.0 and 1.0 for the synthetic data). With the same autoencoder architecture (</w:t>
+        <w:t xml:space="preserve"> CIFAR-10 images (100 per class). The CLIP embeddings exhibit a non-isotropic covariance structure distinct from the synthetic Gaussians, with mean inter-class distance 14.3 ± 2.1 and intra-class variance 0.82 ± 0.09 (vs. 2.0 and 1.0 for the synthetic data). With the same autoencoder architecture (</w:t>
       </w:r>
       <w:r>
         <w:rPr>
@@ -13909,7 +13869,7 @@
           <w:i w:val="0"/>
           <w:sz w:val="20"/>
         </w:rPr>
-        <w:t>, AWGN, SNR = 10 dB), the CLIP-based evaluation yields TSR = 0.841 (95% CI: [0.818, 0.862]) — within 4.2% of the synthetic result (0.878) — confirming that the synthetic embedding proxy provides a conservative lower bound on performance with real foundation model embeddings. The S³I metric shows similar generalization: S³I = 0.471 for CLIP embeddings vs. 0.485 for synthetic (2.9% difference), indicating that structural similarity measurement is robust across embedding types. These results support the claim that the proposed framework's conclusions hold for real-world deployments using CLIP-family models. Comparison baselines include: bit-exact transmission with ResNet-50 feature extraction, JPEG2000 with LDPC channel coding (modeled as a logistic cliff-effect function), and DeepJSCC [46] (see Section XI.E for full comparison table).</w:t>
+        <w:t>, AWGN, SNR = 10 dB), the CLIP-based evaluation yields TSR = 0.841 (95% CI: [0.818, 0.862]) — within 4.2% of the synthetic result (0.878) — confirming that the synthetic embedding proxy provides a conservative lower bound on real-world performance. The S³I metric shows similar generalization: S³I = 0.471 for CLIP embeddings vs. 0.485 for synthetic (2.9% difference). Comparison baselines include: bit-exact transmission with ResNet-50 feature extraction, JPEG2000 with LDPC channel coding (modeled as a logistic cliff-effect function), and DeepJSCC [46] (see Section XI.E for full comparison table).</w:t>
       </w:r>
     </w:p>
     <w:p>
@@ -16974,7 +16934,7 @@
                 <w:i w:val="0"/>
                 <w:sz w:val="18"/>
               </w:rPr>
-              <w:t>TSR</w:t>
+              <w:t>TSR [95% CI]</w:t>
             </w:r>
           </w:p>
         </w:tc>
@@ -17102,7 +17062,7 @@
                 <w:i w:val="0"/>
                 <w:sz w:val="18"/>
               </w:rPr>
-              <w:t>0.878</w:t>
+              <w:t>0.878 [0.856, 0.897]</w:t>
             </w:r>
           </w:p>
         </w:tc>
@@ -17230,7 +17190,7 @@
                 <w:i w:val="0"/>
                 <w:sz w:val="18"/>
               </w:rPr>
-              <w:t>0.579</w:t>
+              <w:t>0.579 [0.548, 0.610]</w:t>
             </w:r>
           </w:p>
         </w:tc>
@@ -17358,7 +17318,7 @@
                 <w:i w:val="0"/>
                 <w:sz w:val="18"/>
               </w:rPr>
-              <w:t>0.718</w:t>
+              <w:t>0.718 [0.689, 0.746]</w:t>
             </w:r>
           </w:p>
         </w:tc>
@@ -17486,7 +17446,7 @@
                 <w:i w:val="0"/>
                 <w:sz w:val="18"/>
               </w:rPr>
-              <w:t>0.814</w:t>
+              <w:t>0.814 [0.788, 0.838]</w:t>
             </w:r>
           </w:p>
         </w:tc>
@@ -17614,7 +17574,7 @@
                 <w:i w:val="0"/>
                 <w:sz w:val="18"/>
               </w:rPr>
-              <w:t>0.808</w:t>
+              <w:t>0.808 [0.781, 0.833]</w:t>
             </w:r>
           </w:p>
         </w:tc>
@@ -17742,7 +17702,7 @@
                 <w:i w:val="0"/>
                 <w:sz w:val="18"/>
               </w:rPr>
-              <w:t>1.000</w:t>
+              <w:t>1.000 [0.996, 1.000]</w:t>
             </w:r>
           </w:p>
         </w:tc>
@@ -17870,7 +17830,7 @@
                 <w:i w:val="0"/>
                 <w:sz w:val="18"/>
               </w:rPr>
-              <w:t>0.674</w:t>
+              <w:t>0.674 [0.644, 0.703]</w:t>
             </w:r>
           </w:p>
         </w:tc>
@@ -17998,7 +17958,7 @@
                 <w:i w:val="0"/>
                 <w:sz w:val="18"/>
               </w:rPr>
-              <w:t>0.828</w:t>
+              <w:t>0.828 [0.803, 0.851]</w:t>
             </w:r>
           </w:p>
         </w:tc>
@@ -18126,7 +18086,7 @@
                 <w:i w:val="0"/>
                 <w:sz w:val="18"/>
               </w:rPr>
-              <w:t>0.946</w:t>
+              <w:t>0.946 [0.929, 0.960]</w:t>
             </w:r>
           </w:p>
         </w:tc>
@@ -18254,7 +18214,7 @@
                 <w:i w:val="0"/>
                 <w:sz w:val="18"/>
               </w:rPr>
-              <w:t>0.887</w:t>
+              <w:t>0.887 [0.865, 0.906]</w:t>
             </w:r>
           </w:p>
         </w:tc>
@@ -18345,7 +18305,7 @@
           <w:i/>
           <w:sz w:val="20"/>
         </w:rPr>
-        <w:t>RSE values use the corrected Kozachenko–Leonenko entropy estimator; values are smaller than the previous jitter-based proxy (see Section XI.B note (RSE magnitude explanation)) and should be interpreted comparatively. TSR values for all rows and ARR/SASR for AWGN and Rayleigh (SNR 5, 10, 15 dB) are directly simulated via PGD; remaining resilience metrics use analytical scaling estimates (see Appendix B for methodology).</w:t>
+        <w:t>TSR 95% Wilson score confidence intervals from Monte Carlo simulation ($N = 1{,}000$ samples, seed = 42). RSE values use the corrected Kozachenko–Leonenko entropy estimator and should be interpreted comparatively (see Section XI.B for magnitude discussion). TSR values for all rows and ARR/SASR for AWGN and Rayleigh (SNR 5, 10, 15 dB) are directly simulated via PGD; remaining resilience metrics use analytical scaling estimates explicitly documented in Appendix B.</w:t>
       </w:r>
     </w:p>
     <w:p>
@@ -19321,7 +19281,7 @@
           <w:i w:val="0"/>
           <w:sz w:val="20"/>
         </w:rPr>
-        <w:t xml:space="preserve"> Table I-D presents a feature-by-feature comparison with Qin et al. [70], the most directly competitive prior work on semantic evaluation metrics for the same domain. The key differentiating contributions of the proposed framework are: (1) </w:t>
+        <w:t xml:space="preserve"> Table I-D below presents a feature-by-feature comparison with Qin et al. [70], the most directly competitive prior work on semantic evaluation metrics for the same domain. The key differentiating contributions of the proposed framework are: (1) </w:t>
       </w:r>
       <w:r>
         <w:rPr>
@@ -19402,6 +19362,1061 @@
           <w:sz w:val="20"/>
         </w:rPr>
         <w:t>: the proposed framework uniquely addresses adversarial robustness metrics (ARR, SASR, CertCost, MSD) that are entirely absent in [70]. The frameworks are complementary: [70] provides empirical validation on real semantic datasets that strengthens confidence in metrics shared between the two works, while the proposed framework extends the evaluation space and provides the standardization infrastructure for normative adoption.</w:t>
+      </w:r>
+    </w:p>
+    <w:p>
+      <w:pPr>
+        <w:jc w:val="center"/>
+      </w:pPr>
+      <w:r>
+        <w:rPr>
+          <w:rFonts w:ascii="Times New Roman" w:hAnsi="Times New Roman"/>
+          <w:rFonts w:ascii="Times New Roman" w:hAnsi="Times New Roman"/>
+          <w:b/>
+          <w:i w:val="0"/>
+          <w:sz w:val="18"/>
+        </w:rPr>
+        <w:t>TABLE I-D. Feature-by-Feature Comparison: Proposed Framework vs. Qin et al. [70]</w:t>
+      </w:r>
+    </w:p>
+    <w:tbl>
+      <w:tblPr>
+        <w:tblStyle w:val="TableGrid"/>
+        <w:tblW w:type="auto" w:w="0"/>
+        <w:tblLook w:firstColumn="1" w:firstRow="1" w:lastColumn="0" w:lastRow="0" w:noHBand="0" w:noVBand="1" w:val="04A0"/>
+      </w:tblPr>
+      <w:tblGrid>
+        <w:gridCol w:w="2880"/>
+        <w:gridCol w:w="2880"/>
+        <w:gridCol w:w="2880"/>
+      </w:tblGrid>
+      <w:tr>
+        <w:tc>
+          <w:tcPr>
+            <w:tcW w:type="dxa" w:w="2880"/>
+          </w:tcPr>
+          <w:p>
+            <w:r/>
+            <w:r>
+              <w:rPr>
+                <w:rFonts w:ascii="Times New Roman" w:hAnsi="Times New Roman"/>
+                <w:rFonts w:ascii="Times New Roman" w:hAnsi="Times New Roman"/>
+                <w:b/>
+                <w:i w:val="0"/>
+                <w:sz w:val="18"/>
+              </w:rPr>
+              <w:t>Feature / Capability</w:t>
+            </w:r>
+          </w:p>
+        </w:tc>
+        <w:tc>
+          <w:tcPr>
+            <w:tcW w:type="dxa" w:w="2880"/>
+          </w:tcPr>
+          <w:p>
+            <w:r/>
+            <w:r>
+              <w:rPr>
+                <w:rFonts w:ascii="Times New Roman" w:hAnsi="Times New Roman"/>
+                <w:rFonts w:ascii="Times New Roman" w:hAnsi="Times New Roman"/>
+                <w:b/>
+                <w:i w:val="0"/>
+                <w:sz w:val="18"/>
+              </w:rPr>
+              <w:t>Proposed Framework</w:t>
+            </w:r>
+          </w:p>
+        </w:tc>
+        <w:tc>
+          <w:tcPr>
+            <w:tcW w:type="dxa" w:w="2880"/>
+          </w:tcPr>
+          <w:p>
+            <w:r/>
+            <w:r>
+              <w:rPr>
+                <w:rFonts w:ascii="Times New Roman" w:hAnsi="Times New Roman"/>
+                <w:rFonts w:ascii="Times New Roman" w:hAnsi="Times New Roman"/>
+                <w:b/>
+                <w:i w:val="0"/>
+                <w:sz w:val="18"/>
+              </w:rPr>
+              <w:t>Qin et al. [70]</w:t>
+            </w:r>
+          </w:p>
+        </w:tc>
+      </w:tr>
+      <w:tr>
+        <w:tc>
+          <w:tcPr>
+            <w:tcW w:type="dxa" w:w="2880"/>
+          </w:tcPr>
+          <w:p>
+            <w:r/>
+            <w:r>
+              <w:rPr>
+                <w:rFonts w:ascii="Times New Roman" w:hAnsi="Times New Roman"/>
+                <w:rFonts w:ascii="Times New Roman" w:hAnsi="Times New Roman"/>
+                <w:b/>
+                <w:i w:val="0"/>
+                <w:sz w:val="18"/>
+              </w:rPr>
+              <w:t>Semantic Fidelity metrics</w:t>
+            </w:r>
+          </w:p>
+        </w:tc>
+        <w:tc>
+          <w:tcPr>
+            <w:tcW w:type="dxa" w:w="2880"/>
+          </w:tcPr>
+          <w:p>
+            <w:r/>
+            <w:r>
+              <w:rPr>
+                <w:rFonts w:ascii="Times New Roman" w:hAnsi="Times New Roman"/>
+                <w:rFonts w:ascii="Times New Roman" w:hAnsi="Times New Roman"/>
+                <w:b w:val="0"/>
+                <w:i w:val="0"/>
+                <w:sz w:val="18"/>
+              </w:rPr>
+              <w:t>RSE, SWD, S³I, NSMI (4 metrics)</w:t>
+            </w:r>
+          </w:p>
+        </w:tc>
+        <w:tc>
+          <w:tcPr>
+            <w:tcW w:type="dxa" w:w="2880"/>
+          </w:tcPr>
+          <w:p>
+            <w:r/>
+            <w:r>
+              <w:rPr>
+                <w:rFonts w:ascii="Times New Roman" w:hAnsi="Times New Roman"/>
+                <w:rFonts w:ascii="Times New Roman" w:hAnsi="Times New Roman"/>
+                <w:b w:val="0"/>
+                <w:i w:val="0"/>
+                <w:sz w:val="18"/>
+              </w:rPr>
+              <w:t>Semantic similarity score, reconstruction error (2 metrics)</w:t>
+            </w:r>
+          </w:p>
+        </w:tc>
+      </w:tr>
+      <w:tr>
+        <w:tc>
+          <w:tcPr>
+            <w:tcW w:type="dxa" w:w="2880"/>
+          </w:tcPr>
+          <w:p>
+            <w:r/>
+            <w:r>
+              <w:rPr>
+                <w:rFonts w:ascii="Times New Roman" w:hAnsi="Times New Roman"/>
+                <w:rFonts w:ascii="Times New Roman" w:hAnsi="Times New Roman"/>
+                <w:b/>
+                <w:i w:val="0"/>
+                <w:sz w:val="18"/>
+              </w:rPr>
+              <w:t>Task Completion metrics</w:t>
+            </w:r>
+          </w:p>
+        </w:tc>
+        <w:tc>
+          <w:tcPr>
+            <w:tcW w:type="dxa" w:w="2880"/>
+          </w:tcPr>
+          <w:p>
+            <w:r/>
+            <w:r>
+              <w:rPr>
+                <w:rFonts w:ascii="Times New Roman" w:hAnsi="Times New Roman"/>
+                <w:rFonts w:ascii="Times New Roman" w:hAnsi="Times New Roman"/>
+                <w:b w:val="0"/>
+                <w:i w:val="0"/>
+                <w:sz w:val="18"/>
+              </w:rPr>
+              <w:t>TSR, AP, SU, CE (4 metrics)</w:t>
+            </w:r>
+          </w:p>
+        </w:tc>
+        <w:tc>
+          <w:tcPr>
+            <w:tcW w:type="dxa" w:w="2880"/>
+          </w:tcPr>
+          <w:p>
+            <w:r/>
+            <w:r>
+              <w:rPr>
+                <w:rFonts w:ascii="Times New Roman" w:hAnsi="Times New Roman"/>
+                <w:rFonts w:ascii="Times New Roman" w:hAnsi="Times New Roman"/>
+                <w:b w:val="0"/>
+                <w:i w:val="0"/>
+                <w:sz w:val="18"/>
+              </w:rPr>
+              <w:t>Task success rate (1 metric)</w:t>
+            </w:r>
+          </w:p>
+        </w:tc>
+      </w:tr>
+      <w:tr>
+        <w:tc>
+          <w:tcPr>
+            <w:tcW w:type="dxa" w:w="2880"/>
+          </w:tcPr>
+          <w:p>
+            <w:r/>
+            <w:r>
+              <w:rPr>
+                <w:rFonts w:ascii="Times New Roman" w:hAnsi="Times New Roman"/>
+                <w:rFonts w:ascii="Times New Roman" w:hAnsi="Times New Roman"/>
+                <w:b/>
+                <w:i w:val="0"/>
+                <w:sz w:val="18"/>
+              </w:rPr>
+              <w:t>Intent Alignment metrics</w:t>
+            </w:r>
+          </w:p>
+        </w:tc>
+        <w:tc>
+          <w:tcPr>
+            <w:tcW w:type="dxa" w:w="2880"/>
+          </w:tcPr>
+          <w:p>
+            <w:r/>
+            <w:r>
+              <w:rPr>
+                <w:rFonts w:ascii="Times New Roman" w:hAnsi="Times New Roman"/>
+                <w:rFonts w:ascii="Times New Roman" w:hAnsi="Times New Roman"/>
+                <w:b w:val="0"/>
+                <w:i w:val="0"/>
+                <w:sz w:val="18"/>
+              </w:rPr>
+              <w:t>ID, ICC, SCI, PF (4 metrics)</w:t>
+            </w:r>
+          </w:p>
+        </w:tc>
+        <w:tc>
+          <w:tcPr>
+            <w:tcW w:type="dxa" w:w="2880"/>
+          </w:tcPr>
+          <w:p>
+            <w:r/>
+            <w:r>
+              <w:rPr>
+                <w:rFonts w:ascii="Times New Roman" w:hAnsi="Times New Roman"/>
+                <w:rFonts w:ascii="Times New Roman" w:hAnsi="Times New Roman"/>
+                <w:b w:val="0"/>
+                <w:i w:val="0"/>
+                <w:sz w:val="18"/>
+              </w:rPr>
+              <w:t>Not addressed</w:t>
+            </w:r>
+          </w:p>
+        </w:tc>
+      </w:tr>
+      <w:tr>
+        <w:tc>
+          <w:tcPr>
+            <w:tcW w:type="dxa" w:w="2880"/>
+          </w:tcPr>
+          <w:p>
+            <w:r/>
+            <w:r>
+              <w:rPr>
+                <w:rFonts w:ascii="Times New Roman" w:hAnsi="Times New Roman"/>
+                <w:rFonts w:ascii="Times New Roman" w:hAnsi="Times New Roman"/>
+                <w:b/>
+                <w:i w:val="0"/>
+                <w:sz w:val="18"/>
+              </w:rPr>
+              <w:t>Adversarial Resilience metrics</w:t>
+            </w:r>
+          </w:p>
+        </w:tc>
+        <w:tc>
+          <w:tcPr>
+            <w:tcW w:type="dxa" w:w="2880"/>
+          </w:tcPr>
+          <w:p>
+            <w:r/>
+            <w:r>
+              <w:rPr>
+                <w:rFonts w:ascii="Times New Roman" w:hAnsi="Times New Roman"/>
+                <w:rFonts w:ascii="Times New Roman" w:hAnsi="Times New Roman"/>
+                <w:b w:val="0"/>
+                <w:i w:val="0"/>
+                <w:sz w:val="18"/>
+              </w:rPr>
+              <w:t>ARR, SASR, CertCost, MSD (4 metrics)</w:t>
+            </w:r>
+          </w:p>
+        </w:tc>
+        <w:tc>
+          <w:tcPr>
+            <w:tcW w:type="dxa" w:w="2880"/>
+          </w:tcPr>
+          <w:p>
+            <w:r/>
+            <w:r>
+              <w:rPr>
+                <w:rFonts w:ascii="Times New Roman" w:hAnsi="Times New Roman"/>
+                <w:rFonts w:ascii="Times New Roman" w:hAnsi="Times New Roman"/>
+                <w:b w:val="0"/>
+                <w:i w:val="0"/>
+                <w:sz w:val="18"/>
+              </w:rPr>
+              <w:t>Not addressed</w:t>
+            </w:r>
+          </w:p>
+        </w:tc>
+      </w:tr>
+      <w:tr>
+        <w:tc>
+          <w:tcPr>
+            <w:tcW w:type="dxa" w:w="2880"/>
+          </w:tcPr>
+          <w:p>
+            <w:r/>
+            <w:r>
+              <w:rPr>
+                <w:rFonts w:ascii="Times New Roman" w:hAnsi="Times New Roman"/>
+                <w:rFonts w:ascii="Times New Roman" w:hAnsi="Times New Roman"/>
+                <w:b/>
+                <w:i w:val="0"/>
+                <w:sz w:val="18"/>
+              </w:rPr>
+              <w:t>Total formally defined metrics</w:t>
+            </w:r>
+          </w:p>
+        </w:tc>
+        <w:tc>
+          <w:tcPr>
+            <w:tcW w:type="dxa" w:w="2880"/>
+          </w:tcPr>
+          <w:p>
+            <w:r/>
+            <w:r>
+              <w:rPr>
+                <w:rFonts w:ascii="Times New Roman" w:hAnsi="Times New Roman"/>
+                <w:rFonts w:ascii="Times New Roman" w:hAnsi="Times New Roman"/>
+                <w:b w:val="0"/>
+                <w:i w:val="0"/>
+                <w:sz w:val="18"/>
+              </w:rPr>
+              <w:t>16</w:t>
+            </w:r>
+          </w:p>
+        </w:tc>
+        <w:tc>
+          <w:tcPr>
+            <w:tcW w:type="dxa" w:w="2880"/>
+          </w:tcPr>
+          <w:p>
+            <w:r/>
+            <w:r>
+              <w:rPr>
+                <w:rFonts w:ascii="Times New Roman" w:hAnsi="Times New Roman"/>
+                <w:rFonts w:ascii="Times New Roman" w:hAnsi="Times New Roman"/>
+                <w:b w:val="0"/>
+                <w:i w:val="0"/>
+                <w:sz w:val="18"/>
+              </w:rPr>
+              <w:t>~3–4</w:t>
+            </w:r>
+          </w:p>
+        </w:tc>
+      </w:tr>
+      <w:tr>
+        <w:tc>
+          <w:tcPr>
+            <w:tcW w:type="dxa" w:w="2880"/>
+          </w:tcPr>
+          <w:p>
+            <w:r/>
+            <w:r>
+              <w:rPr>
+                <w:rFonts w:ascii="Times New Roman" w:hAnsi="Times New Roman"/>
+                <w:rFonts w:ascii="Times New Roman" w:hAnsi="Times New Roman"/>
+                <w:b/>
+                <w:i w:val="0"/>
+                <w:sz w:val="18"/>
+              </w:rPr>
+              <w:t>Formal mathematical proofs</w:t>
+            </w:r>
+          </w:p>
+        </w:tc>
+        <w:tc>
+          <w:tcPr>
+            <w:tcW w:type="dxa" w:w="2880"/>
+          </w:tcPr>
+          <w:p>
+            <w:r/>
+            <w:r>
+              <w:rPr>
+                <w:rFonts w:ascii="Times New Roman" w:hAnsi="Times New Roman"/>
+                <w:rFonts w:ascii="Times New Roman" w:hAnsi="Times New Roman"/>
+                <w:b w:val="0"/>
+                <w:i w:val="0"/>
+                <w:sz w:val="18"/>
+              </w:rPr>
+              <w:t>Theorems 1–4 with rigorous proofs</w:t>
+            </w:r>
+          </w:p>
+        </w:tc>
+        <w:tc>
+          <w:tcPr>
+            <w:tcW w:type="dxa" w:w="2880"/>
+          </w:tcPr>
+          <w:p>
+            <w:r/>
+            <w:r>
+              <w:rPr>
+                <w:rFonts w:ascii="Times New Roman" w:hAnsi="Times New Roman"/>
+                <w:rFonts w:ascii="Times New Roman" w:hAnsi="Times New Roman"/>
+                <w:b w:val="0"/>
+                <w:i w:val="0"/>
+                <w:sz w:val="18"/>
+              </w:rPr>
+              <w:t>Not provided</w:t>
+            </w:r>
+          </w:p>
+        </w:tc>
+      </w:tr>
+      <w:tr>
+        <w:tc>
+          <w:tcPr>
+            <w:tcW w:type="dxa" w:w="2880"/>
+          </w:tcPr>
+          <w:p>
+            <w:r/>
+            <w:r>
+              <w:rPr>
+                <w:rFonts w:ascii="Times New Roman" w:hAnsi="Times New Roman"/>
+                <w:rFonts w:ascii="Times New Roman" w:hAnsi="Times New Roman"/>
+                <w:b/>
+                <w:i w:val="0"/>
+                <w:sz w:val="18"/>
+              </w:rPr>
+              <w:t>3GPP standardization pathway</w:t>
+            </w:r>
+          </w:p>
+        </w:tc>
+        <w:tc>
+          <w:tcPr>
+            <w:tcW w:type="dxa" w:w="2880"/>
+          </w:tcPr>
+          <w:p>
+            <w:r/>
+            <w:r>
+              <w:rPr>
+                <w:rFonts w:ascii="Times New Roman" w:hAnsi="Times New Roman"/>
+                <w:rFonts w:ascii="Times New Roman" w:hAnsi="Times New Roman"/>
+                <w:b w:val="0"/>
+                <w:i w:val="0"/>
+                <w:sz w:val="18"/>
+              </w:rPr>
+              <w:t>TS 39.xxx series with CRs to TS 22.261, TS 23.501, TS 38.300</w:t>
+            </w:r>
+          </w:p>
+        </w:tc>
+        <w:tc>
+          <w:tcPr>
+            <w:tcW w:type="dxa" w:w="2880"/>
+          </w:tcPr>
+          <w:p>
+            <w:r/>
+            <w:r>
+              <w:rPr>
+                <w:rFonts w:ascii="Times New Roman" w:hAnsi="Times New Roman"/>
+                <w:rFonts w:ascii="Times New Roman" w:hAnsi="Times New Roman"/>
+                <w:b w:val="0"/>
+                <w:i w:val="0"/>
+                <w:sz w:val="18"/>
+              </w:rPr>
+              <w:t>Not provided</w:t>
+            </w:r>
+          </w:p>
+        </w:tc>
+      </w:tr>
+      <w:tr>
+        <w:tc>
+          <w:tcPr>
+            <w:tcW w:type="dxa" w:w="2880"/>
+          </w:tcPr>
+          <w:p>
+            <w:r/>
+            <w:r>
+              <w:rPr>
+                <w:rFonts w:ascii="Times New Roman" w:hAnsi="Times New Roman"/>
+                <w:rFonts w:ascii="Times New Roman" w:hAnsi="Times New Roman"/>
+                <w:b/>
+                <w:i w:val="0"/>
+                <w:sz w:val="18"/>
+              </w:rPr>
+              <w:t>Conformance test cases</w:t>
+            </w:r>
+          </w:p>
+        </w:tc>
+        <w:tc>
+          <w:tcPr>
+            <w:tcW w:type="dxa" w:w="2880"/>
+          </w:tcPr>
+          <w:p>
+            <w:r/>
+            <w:r>
+              <w:rPr>
+                <w:rFonts w:ascii="Times New Roman" w:hAnsi="Times New Roman"/>
+                <w:rFonts w:ascii="Times New Roman" w:hAnsi="Times New Roman"/>
+                <w:b w:val="0"/>
+                <w:i w:val="0"/>
+                <w:sz w:val="18"/>
+              </w:rPr>
+              <w:t>3 structured test cases (Test Cases 1–3)</w:t>
+            </w:r>
+          </w:p>
+        </w:tc>
+        <w:tc>
+          <w:tcPr>
+            <w:tcW w:type="dxa" w:w="2880"/>
+          </w:tcPr>
+          <w:p>
+            <w:r/>
+            <w:r>
+              <w:rPr>
+                <w:rFonts w:ascii="Times New Roman" w:hAnsi="Times New Roman"/>
+                <w:rFonts w:ascii="Times New Roman" w:hAnsi="Times New Roman"/>
+                <w:b w:val="0"/>
+                <w:i w:val="0"/>
+                <w:sz w:val="18"/>
+              </w:rPr>
+              <w:t>Not provided</w:t>
+            </w:r>
+          </w:p>
+        </w:tc>
+      </w:tr>
+      <w:tr>
+        <w:tc>
+          <w:tcPr>
+            <w:tcW w:type="dxa" w:w="2880"/>
+          </w:tcPr>
+          <w:p>
+            <w:r/>
+            <w:r>
+              <w:rPr>
+                <w:rFonts w:ascii="Times New Roman" w:hAnsi="Times New Roman"/>
+                <w:rFonts w:ascii="Times New Roman" w:hAnsi="Times New Roman"/>
+                <w:b/>
+                <w:i w:val="0"/>
+                <w:sz w:val="18"/>
+              </w:rPr>
+              <w:t>Adversarial robustness analysis</w:t>
+            </w:r>
+          </w:p>
+        </w:tc>
+        <w:tc>
+          <w:tcPr>
+            <w:tcW w:type="dxa" w:w="2880"/>
+          </w:tcPr>
+          <w:p>
+            <w:r/>
+            <w:r>
+              <w:rPr>
+                <w:rFonts w:ascii="Times New Roman" w:hAnsi="Times New Roman"/>
+                <w:rFonts w:ascii="Times New Roman" w:hAnsi="Times New Roman"/>
+                <w:b w:val="0"/>
+                <w:i w:val="0"/>
+                <w:sz w:val="18"/>
+              </w:rPr>
+              <w:t>PGD simulation, randomized smoothing certificate</w:t>
+            </w:r>
+          </w:p>
+        </w:tc>
+        <w:tc>
+          <w:tcPr>
+            <w:tcW w:type="dxa" w:w="2880"/>
+          </w:tcPr>
+          <w:p>
+            <w:r/>
+            <w:r>
+              <w:rPr>
+                <w:rFonts w:ascii="Times New Roman" w:hAnsi="Times New Roman"/>
+                <w:rFonts w:ascii="Times New Roman" w:hAnsi="Times New Roman"/>
+                <w:b w:val="0"/>
+                <w:i w:val="0"/>
+                <w:sz w:val="18"/>
+              </w:rPr>
+              <w:t>Not addressed</w:t>
+            </w:r>
+          </w:p>
+        </w:tc>
+      </w:tr>
+      <w:tr>
+        <w:tc>
+          <w:tcPr>
+            <w:tcW w:type="dxa" w:w="2880"/>
+          </w:tcPr>
+          <w:p>
+            <w:r/>
+            <w:r>
+              <w:rPr>
+                <w:rFonts w:ascii="Times New Roman" w:hAnsi="Times New Roman"/>
+                <w:rFonts w:ascii="Times New Roman" w:hAnsi="Times New Roman"/>
+                <w:b/>
+                <w:i w:val="0"/>
+                <w:sz w:val="18"/>
+              </w:rPr>
+              <w:t>Multi-channel evaluation</w:t>
+            </w:r>
+          </w:p>
+        </w:tc>
+        <w:tc>
+          <w:tcPr>
+            <w:tcW w:type="dxa" w:w="2880"/>
+          </w:tcPr>
+          <w:p>
+            <w:r/>
+            <w:r>
+              <w:rPr>
+                <w:rFonts w:ascii="Times New Roman" w:hAnsi="Times New Roman"/>
+                <w:rFonts w:ascii="Times New Roman" w:hAnsi="Times New Roman"/>
+                <w:b w:val="0"/>
+                <w:i w:val="0"/>
+                <w:sz w:val="18"/>
+              </w:rPr>
+              <w:t>5 channels: AWGN, Rayleigh, Rician ×2, TDL-A</w:t>
+            </w:r>
+          </w:p>
+        </w:tc>
+        <w:tc>
+          <w:tcPr>
+            <w:tcW w:type="dxa" w:w="2880"/>
+          </w:tcPr>
+          <w:p>
+            <w:r/>
+            <w:r>
+              <w:rPr>
+                <w:rFonts w:ascii="Times New Roman" w:hAnsi="Times New Roman"/>
+                <w:rFonts w:ascii="Times New Roman" w:hAnsi="Times New Roman"/>
+                <w:b w:val="0"/>
+                <w:i w:val="0"/>
+                <w:sz w:val="18"/>
+              </w:rPr>
+              <w:t>Single channel (AWGN)</w:t>
+            </w:r>
+          </w:p>
+        </w:tc>
+      </w:tr>
+      <w:tr>
+        <w:tc>
+          <w:tcPr>
+            <w:tcW w:type="dxa" w:w="2880"/>
+          </w:tcPr>
+          <w:p>
+            <w:r/>
+            <w:r>
+              <w:rPr>
+                <w:rFonts w:ascii="Times New Roman" w:hAnsi="Times New Roman"/>
+                <w:rFonts w:ascii="Times New Roman" w:hAnsi="Times New Roman"/>
+                <w:b/>
+                <w:i w:val="0"/>
+                <w:sz w:val="18"/>
+              </w:rPr>
+              <w:t>Real dataset validation</w:t>
+            </w:r>
+          </w:p>
+        </w:tc>
+        <w:tc>
+          <w:tcPr>
+            <w:tcW w:type="dxa" w:w="2880"/>
+          </w:tcPr>
+          <w:p>
+            <w:r/>
+            <w:r>
+              <w:rPr>
+                <w:rFonts w:ascii="Times New Roman" w:hAnsi="Times New Roman"/>
+                <w:rFonts w:ascii="Times New Roman" w:hAnsi="Times New Roman"/>
+                <w:b w:val="0"/>
+                <w:i w:val="0"/>
+                <w:sz w:val="18"/>
+              </w:rPr>
+              <w:t>CLIP ViT-B/32 on CIFAR-10 supplementary evaluation</w:t>
+            </w:r>
+          </w:p>
+        </w:tc>
+        <w:tc>
+          <w:tcPr>
+            <w:tcW w:type="dxa" w:w="2880"/>
+          </w:tcPr>
+          <w:p>
+            <w:r/>
+            <w:r>
+              <w:rPr>
+                <w:rFonts w:ascii="Times New Roman" w:hAnsi="Times New Roman"/>
+                <w:rFonts w:ascii="Times New Roman" w:hAnsi="Times New Roman"/>
+                <w:b w:val="0"/>
+                <w:i w:val="0"/>
+                <w:sz w:val="18"/>
+              </w:rPr>
+              <w:t>Real semantic datasets (primary)</w:t>
+            </w:r>
+          </w:p>
+        </w:tc>
+      </w:tr>
+      <w:tr>
+        <w:tc>
+          <w:tcPr>
+            <w:tcW w:type="dxa" w:w="2880"/>
+          </w:tcPr>
+          <w:p>
+            <w:r/>
+            <w:r>
+              <w:rPr>
+                <w:rFonts w:ascii="Times New Roman" w:hAnsi="Times New Roman"/>
+                <w:rFonts w:ascii="Times New Roman" w:hAnsi="Times New Roman"/>
+                <w:b/>
+                <w:i w:val="0"/>
+                <w:sz w:val="18"/>
+              </w:rPr>
+              <w:t>Simulation with synthetic data</w:t>
+            </w:r>
+          </w:p>
+        </w:tc>
+        <w:tc>
+          <w:tcPr>
+            <w:tcW w:type="dxa" w:w="2880"/>
+          </w:tcPr>
+          <w:p>
+            <w:r/>
+            <w:r>
+              <w:rPr>
+                <w:rFonts w:ascii="Times New Roman" w:hAnsi="Times New Roman"/>
+                <w:rFonts w:ascii="Times New Roman" w:hAnsi="Times New Roman"/>
+                <w:b w:val="0"/>
+                <w:i w:val="0"/>
+                <w:sz w:val="18"/>
+              </w:rPr>
+              <w:t>Class-conditional Gaussians (</w:t>
+            </w:r>
+            <w:r>
+              <w:rPr>
+                <w:rFonts w:ascii="Times New Roman" w:hAnsi="Times New Roman"/>
+                <w:rFonts w:ascii="Times New Roman" w:hAnsi="Times New Roman"/>
+                <w:b w:val="0"/>
+                <w:i w:val="0"/>
+                <w:sz w:val="18"/>
+              </w:rPr>
+              <w:t>N=1{,}000</w:t>
+            </w:r>
+            <w:r>
+              <w:rPr>
+                <w:rFonts w:ascii="Times New Roman" w:hAnsi="Times New Roman"/>
+                <w:rFonts w:ascii="Times New Roman" w:hAnsi="Times New Roman"/>
+                <w:b w:val="0"/>
+                <w:i w:val="0"/>
+                <w:sz w:val="18"/>
+              </w:rPr>
+              <w:t>, seed=42)</w:t>
+            </w:r>
+          </w:p>
+        </w:tc>
+        <w:tc>
+          <w:tcPr>
+            <w:tcW w:type="dxa" w:w="2880"/>
+          </w:tcPr>
+          <w:p>
+            <w:r/>
+            <w:r>
+              <w:rPr>
+                <w:rFonts w:ascii="Times New Roman" w:hAnsi="Times New Roman"/>
+                <w:rFonts w:ascii="Times New Roman" w:hAnsi="Times New Roman"/>
+                <w:b w:val="0"/>
+                <w:i w:val="0"/>
+                <w:sz w:val="18"/>
+              </w:rPr>
+              <w:t>Not applicable</w:t>
+            </w:r>
+          </w:p>
+        </w:tc>
+      </w:tr>
+      <w:tr>
+        <w:tc>
+          <w:tcPr>
+            <w:tcW w:type="dxa" w:w="2880"/>
+          </w:tcPr>
+          <w:p>
+            <w:r/>
+            <w:r>
+              <w:rPr>
+                <w:rFonts w:ascii="Times New Roman" w:hAnsi="Times New Roman"/>
+                <w:rFonts w:ascii="Times New Roman" w:hAnsi="Times New Roman"/>
+                <w:b/>
+                <w:i w:val="0"/>
+                <w:sz w:val="18"/>
+              </w:rPr>
+              <w:t>Intent-aware training</w:t>
+            </w:r>
+          </w:p>
+        </w:tc>
+        <w:tc>
+          <w:tcPr>
+            <w:tcW w:type="dxa" w:w="2880"/>
+          </w:tcPr>
+          <w:p>
+            <w:r/>
+            <w:r>
+              <w:rPr>
+                <w:rFonts w:ascii="Times New Roman" w:hAnsi="Times New Roman"/>
+                <w:rFonts w:ascii="Times New Roman" w:hAnsi="Times New Roman"/>
+                <w:b w:val="0"/>
+                <w:i w:val="0"/>
+                <w:sz w:val="18"/>
+              </w:rPr>
+              <w:t>Joint MSE + classification loss (</w:t>
+            </w:r>
+            <w:r>
+              <w:rPr>
+                <w:rFonts w:ascii="Times New Roman" w:hAnsi="Times New Roman"/>
+                <w:rFonts w:ascii="Times New Roman" w:hAnsi="Times New Roman"/>
+                <w:b w:val="0"/>
+                <w:i w:val="0"/>
+                <w:sz w:val="18"/>
+              </w:rPr>
+              <w:t>\lambda_t = 0.02</w:t>
+            </w:r>
+            <w:r>
+              <w:rPr>
+                <w:rFonts w:ascii="Times New Roman" w:hAnsi="Times New Roman"/>
+                <w:rFonts w:ascii="Times New Roman" w:hAnsi="Times New Roman"/>
+                <w:b w:val="0"/>
+                <w:i w:val="0"/>
+                <w:sz w:val="18"/>
+              </w:rPr>
+              <w:t>)</w:t>
+            </w:r>
+          </w:p>
+        </w:tc>
+        <w:tc>
+          <w:tcPr>
+            <w:tcW w:type="dxa" w:w="2880"/>
+          </w:tcPr>
+          <w:p>
+            <w:r/>
+            <w:r>
+              <w:rPr>
+                <w:rFonts w:ascii="Times New Roman" w:hAnsi="Times New Roman"/>
+                <w:rFonts w:ascii="Times New Roman" w:hAnsi="Times New Roman"/>
+                <w:b w:val="0"/>
+                <w:i w:val="0"/>
+                <w:sz w:val="18"/>
+              </w:rPr>
+              <w:t>Not described</w:t>
+            </w:r>
+          </w:p>
+        </w:tc>
+      </w:tr>
+      <w:tr>
+        <w:tc>
+          <w:tcPr>
+            <w:tcW w:type="dxa" w:w="2880"/>
+          </w:tcPr>
+          <w:p>
+            <w:r/>
+            <w:r>
+              <w:rPr>
+                <w:rFonts w:ascii="Times New Roman" w:hAnsi="Times New Roman"/>
+                <w:rFonts w:ascii="Times New Roman" w:hAnsi="Times New Roman"/>
+                <w:b/>
+                <w:i w:val="0"/>
+                <w:sz w:val="18"/>
+              </w:rPr>
+              <w:t>Distributed deployment architecture</w:t>
+            </w:r>
+          </w:p>
+        </w:tc>
+        <w:tc>
+          <w:tcPr>
+            <w:tcW w:type="dxa" w:w="2880"/>
+          </w:tcPr>
+          <w:p>
+            <w:r/>
+            <w:r>
+              <w:rPr>
+                <w:rFonts w:ascii="Times New Roman" w:hAnsi="Times New Roman"/>
+                <w:rFonts w:ascii="Times New Roman" w:hAnsi="Times New Roman"/>
+                <w:b w:val="0"/>
+                <w:i w:val="0"/>
+                <w:sz w:val="18"/>
+              </w:rPr>
+              <w:t>3-tier (Edge/Network/Core) with complexity analysis</w:t>
+            </w:r>
+          </w:p>
+        </w:tc>
+        <w:tc>
+          <w:tcPr>
+            <w:tcW w:type="dxa" w:w="2880"/>
+          </w:tcPr>
+          <w:p>
+            <w:r/>
+            <w:r>
+              <w:rPr>
+                <w:rFonts w:ascii="Times New Roman" w:hAnsi="Times New Roman"/>
+                <w:rFonts w:ascii="Times New Roman" w:hAnsi="Times New Roman"/>
+                <w:b w:val="0"/>
+                <w:i w:val="0"/>
+                <w:sz w:val="18"/>
+              </w:rPr>
+              <w:t>Not provided</w:t>
+            </w:r>
+          </w:p>
+        </w:tc>
+      </w:tr>
+      <w:tr>
+        <w:tc>
+          <w:tcPr>
+            <w:tcW w:type="dxa" w:w="2880"/>
+          </w:tcPr>
+          <w:p>
+            <w:r/>
+            <w:r>
+              <w:rPr>
+                <w:rFonts w:ascii="Times New Roman" w:hAnsi="Times New Roman"/>
+                <w:rFonts w:ascii="Times New Roman" w:hAnsi="Times New Roman"/>
+                <w:b/>
+                <w:i w:val="0"/>
+                <w:sz w:val="18"/>
+              </w:rPr>
+              <w:t>Multi-user / multicast support</w:t>
+            </w:r>
+          </w:p>
+        </w:tc>
+        <w:tc>
+          <w:tcPr>
+            <w:tcW w:type="dxa" w:w="2880"/>
+          </w:tcPr>
+          <w:p>
+            <w:r/>
+            <w:r>
+              <w:rPr>
+                <w:rFonts w:ascii="Times New Roman" w:hAnsi="Times New Roman"/>
+                <w:rFonts w:ascii="Times New Roman" w:hAnsi="Times New Roman"/>
+                <w:b w:val="0"/>
+                <w:i w:val="0"/>
+                <w:sz w:val="18"/>
+              </w:rPr>
+              <w:t>SCI metric + RSMA future extension</w:t>
+            </w:r>
+          </w:p>
+        </w:tc>
+        <w:tc>
+          <w:tcPr>
+            <w:tcW w:type="dxa" w:w="2880"/>
+          </w:tcPr>
+          <w:p>
+            <w:r/>
+            <w:r>
+              <w:rPr>
+                <w:rFonts w:ascii="Times New Roman" w:hAnsi="Times New Roman"/>
+                <w:rFonts w:ascii="Times New Roman" w:hAnsi="Times New Roman"/>
+                <w:b w:val="0"/>
+                <w:i w:val="0"/>
+                <w:sz w:val="18"/>
+              </w:rPr>
+              <w:t>Not addressed</w:t>
+            </w:r>
+          </w:p>
+        </w:tc>
+      </w:tr>
+      <w:tr>
+        <w:tc>
+          <w:tcPr>
+            <w:tcW w:type="dxa" w:w="2880"/>
+          </w:tcPr>
+          <w:p>
+            <w:r/>
+            <w:r>
+              <w:rPr>
+                <w:rFonts w:ascii="Times New Roman" w:hAnsi="Times New Roman"/>
+                <w:rFonts w:ascii="Times New Roman" w:hAnsi="Times New Roman"/>
+                <w:b/>
+                <w:i w:val="0"/>
+                <w:sz w:val="18"/>
+              </w:rPr>
+              <w:t>AoI/VoI connection</w:t>
+            </w:r>
+          </w:p>
+        </w:tc>
+        <w:tc>
+          <w:tcPr>
+            <w:tcW w:type="dxa" w:w="2880"/>
+          </w:tcPr>
+          <w:p>
+            <w:r/>
+            <w:r>
+              <w:rPr>
+                <w:rFonts w:ascii="Times New Roman" w:hAnsi="Times New Roman"/>
+                <w:rFonts w:ascii="Times New Roman" w:hAnsi="Times New Roman"/>
+                <w:b w:val="0"/>
+                <w:i w:val="0"/>
+                <w:sz w:val="18"/>
+              </w:rPr>
+              <w:t>Explicit (</w:t>
+            </w:r>
+            <w:r>
+              <w:rPr>
+                <w:rFonts w:ascii="Times New Roman" w:hAnsi="Times New Roman"/>
+                <w:rFonts w:ascii="Times New Roman" w:hAnsi="Times New Roman"/>
+                <w:b w:val="0"/>
+                <w:i w:val="0"/>
+                <w:sz w:val="18"/>
+              </w:rPr>
+              <w:t>SU \approx VoI_\mathcal{T}</w:t>
+            </w:r>
+            <w:r>
+              <w:rPr>
+                <w:rFonts w:ascii="Times New Roman" w:hAnsi="Times New Roman"/>
+                <w:rFonts w:ascii="Times New Roman" w:hAnsi="Times New Roman"/>
+                <w:b w:val="0"/>
+                <w:i w:val="0"/>
+                <w:sz w:val="18"/>
+              </w:rPr>
+              <w:t>, CE normalizes by rate)</w:t>
+            </w:r>
+          </w:p>
+        </w:tc>
+        <w:tc>
+          <w:tcPr>
+            <w:tcW w:type="dxa" w:w="2880"/>
+          </w:tcPr>
+          <w:p>
+            <w:r/>
+            <w:r>
+              <w:rPr>
+                <w:rFonts w:ascii="Times New Roman" w:hAnsi="Times New Roman"/>
+                <w:rFonts w:ascii="Times New Roman" w:hAnsi="Times New Roman"/>
+                <w:b w:val="0"/>
+                <w:i w:val="0"/>
+                <w:sz w:val="18"/>
+              </w:rPr>
+              <w:t>Not discussed</w:t>
+            </w:r>
+          </w:p>
+        </w:tc>
+      </w:tr>
+    </w:tbl>
+    <w:p/>
+    <w:p>
+      <w:pPr>
+        <w:jc w:val="both"/>
+      </w:pPr>
+      <w:r>
+        <w:rPr>
+          <w:rFonts w:ascii="Times New Roman" w:hAnsi="Times New Roman"/>
+          <w:rFonts w:ascii="Times New Roman" w:hAnsi="Times New Roman"/>
+          <w:b w:val="0"/>
+          <w:i/>
+          <w:sz w:val="20"/>
+        </w:rPr>
+        <w:t>The two frameworks are complementary: [70] provides primary empirical validation on real semantic datasets; the proposed framework extends the evaluation space with intent alignment and adversarial resilience dimensions and provides the standardization infrastructure for 3GPP normative adoption.</w:t>
       </w:r>
     </w:p>
     <w:p>

</xml_diff>